<commit_message>
Update OIB practicum and project specification
</commit_message>
<xml_diff>
--- a/Osnove informacione bezbednosti (OIB)/Projekat/Projektna_Specifikacija_OIB.docx
+++ b/Osnove informacione bezbednosti (OIB)/Projekat/Projektna_Specifikacija_OIB.docx
@@ -9,14 +9,14 @@
         <w:tblLook w:val="04A0" w:firstRow="1" w:lastRow="0" w:firstColumn="1" w:lastColumn="0" w:noHBand="0" w:noVBand="1"/>
       </w:tblPr>
       <w:tblGrid>
-        <w:gridCol w:w="2358"/>
-        <w:gridCol w:w="4500"/>
-        <w:gridCol w:w="2214"/>
+        <w:gridCol w:w="2518"/>
+        <w:gridCol w:w="4394"/>
+        <w:gridCol w:w="2160"/>
       </w:tblGrid>
       <w:tr>
         <w:tc>
           <w:tcPr>
-            <w:tcW w:w="2358" w:type="dxa"/>
+            <w:tcW w:w="2518" w:type="dxa"/>
             <w:tcBorders>
               <w:bottom w:val="single" w:sz="6" w:space="0" w:color="686868"/>
             </w:tcBorders>
@@ -73,7 +73,7 @@
         </w:tc>
         <w:tc>
           <w:tcPr>
-            <w:tcW w:w="4500" w:type="dxa"/>
+            <w:tcW w:w="4394" w:type="dxa"/>
             <w:tcBorders>
               <w:bottom w:val="single" w:sz="6" w:space="0" w:color="686868"/>
             </w:tcBorders>
@@ -110,7 +110,7 @@
         </w:tc>
         <w:tc>
           <w:tcPr>
-            <w:tcW w:w="2214" w:type="dxa"/>
+            <w:tcW w:w="2160" w:type="dxa"/>
             <w:tcBorders>
               <w:bottom w:val="single" w:sz="6" w:space="0" w:color="686868"/>
             </w:tcBorders>
@@ -170,46 +170,38 @@
     </w:tbl>
     <w:p>
       <w:pPr>
-        <w:pStyle w:val="Title"/>
-        <w:spacing w:before="2948" w:after="160"/>
+        <w:keepNext/>
+        <w:keepLines/>
+        <w:spacing w:before="3912" w:after="280"/>
         <w:jc w:val="center"/>
         <w:rPr>
-          <w:rFonts w:ascii="Liberation Serif" w:hAnsi="Liberation Serif" w:cs="Liberation Serif"/>
+          <w:b/>
+          <w:color w:val="1B1B1B"/>
+          <w:sz w:val="39"/>
         </w:rPr>
       </w:pPr>
       <w:r>
         <w:rPr>
-          <w:rFonts w:ascii="Liberation Serif" w:hAnsi="Liberation Serif" w:cs="Liberation Serif"/>
-        </w:rPr>
-        <w:t>ПРОЈЕКТНА СПЕЦИФИКАЦИЈА</w:t>
+          <w:b/>
+          <w:color w:val="1B1B1B"/>
+          <w:sz w:val="39"/>
+        </w:rPr>
+        <w:t>ПЛАТФОРМА ЗА ИНТЕРАКТИВНЕ ЛАБОРАТОРИЈСКЕ ВЕЖБЕ</w:t>
       </w:r>
     </w:p>
     <w:p>
       <w:pPr>
-        <w:spacing w:before="539" w:after="0"/>
+        <w:keepNext/>
+        <w:keepLines/>
+        <w:spacing w:after="0"/>
         <w:jc w:val="center"/>
-        <w:rPr>
-          <w:rFonts w:cs="Liberation Serif"/>
-        </w:rPr>
       </w:pPr>
       <w:r>
         <w:rPr>
-          <w:rFonts w:cs="Liberation Serif"/>
-          <w:b/>
-          <w:color w:val="1E1E1E"/>
-          <w:sz w:val="34"/>
-        </w:rPr>
-        <w:t>Платформа за интерактивне лабораторијске вежбе</w:t>
-      </w:r>
-      <w:r>
-        <w:rPr>
-          <w:rFonts w:cs="Liberation Serif"/>
-          <w:b/>
-          <w:color w:val="1E1E1E"/>
-          <w:sz w:val="34"/>
-        </w:rPr>
-        <w:br/>
-        <w:t>из информационе безбедности</w:t>
+          <w:color w:val="1B1B1B"/>
+          <w:sz w:val="36"/>
+        </w:rPr>
+        <w:t>ПРОЈЕКТНА СПЕЦИФИКАЦИЈА</w:t>
       </w:r>
     </w:p>
     <w:p>
@@ -239,44 +231,7 @@
           <w:szCs w:val="32"/>
         </w:rPr>
         <w:br/>
-      </w:r>
-      <w:r>
-        <w:rPr>
-          <w:rFonts w:cs="Liberation Serif"/>
-          <w:color w:val="222222"/>
-          <w:sz w:val="32"/>
-          <w:szCs w:val="32"/>
-        </w:rPr>
-        <w:br/>
-      </w:r>
-      <w:r>
-        <w:rPr>
-          <w:rFonts w:cs="Liberation Serif"/>
-          <w:color w:val="222222"/>
-          <w:sz w:val="32"/>
-          <w:szCs w:val="32"/>
-        </w:rPr>
-        <w:br/>
-      </w:r>
-      <w:proofErr w:type="spellStart"/>
-      <w:r>
-        <w:rPr>
-          <w:rFonts w:cs="Liberation Serif"/>
-          <w:color w:val="222222"/>
-          <w:sz w:val="32"/>
-          <w:szCs w:val="32"/>
-        </w:rPr>
-        <w:t>Нови</w:t>
-      </w:r>
-      <w:proofErr w:type="spellEnd"/>
-      <w:r>
-        <w:rPr>
-          <w:rFonts w:cs="Liberation Serif"/>
-          <w:color w:val="222222"/>
-          <w:sz w:val="32"/>
-          <w:szCs w:val="32"/>
-        </w:rPr>
-        <w:t xml:space="preserve"> Сад, 2026.</w:t>
+        <w:t>Нови Сад</w:t>
       </w:r>
     </w:p>
     <w:p>
@@ -881,7 +836,7 @@
           <w:rFonts w:cs="Liberation Serif"/>
         </w:rPr>
         <w:tab/>
-        <w:t>11</w:t>
+        <w:t>12</w:t>
       </w:r>
     </w:p>
     <w:p>
@@ -1074,7 +1029,7 @@
           <w:rFonts w:cs="Liberation Serif"/>
         </w:rPr>
         <w:tab/>
-        <w:t>19</w:t>
+        <w:t>20</w:t>
       </w:r>
     </w:p>
     <w:p>
@@ -1269,31 +1224,13 @@
           <w:rFonts w:cs="Liberation Serif"/>
         </w:rPr>
       </w:pPr>
-      <w:proofErr w:type="spellStart"/>
       <w:r>
         <w:rPr>
           <w:rFonts w:cs="Liberation Serif"/>
           <w:b/>
         </w:rPr>
-        <w:t>Основни</w:t>
+        <w:t>Основни принципи</w:t>
       </w:r>
-      <w:proofErr w:type="spellEnd"/>
-      <w:r>
-        <w:rPr>
-          <w:rFonts w:cs="Liberation Serif"/>
-          <w:b/>
-        </w:rPr>
-        <w:t xml:space="preserve"> </w:t>
-      </w:r>
-      <w:proofErr w:type="spellStart"/>
-      <w:r>
-        <w:rPr>
-          <w:rFonts w:cs="Liberation Serif"/>
-          <w:b/>
-        </w:rPr>
-        <w:t>принципи</w:t>
-      </w:r>
-      <w:proofErr w:type="spellEnd"/>
     </w:p>
     <w:p>
       <w:pPr>
@@ -1320,72 +1257,8 @@
         <w:rPr>
           <w:rFonts w:cs="Liberation Serif"/>
         </w:rPr>
-        <w:t xml:space="preserve">•  </w:t>
+        <w:t>•  Модуларни монолит са јасним границама</w:t>
       </w:r>
-      <w:proofErr w:type="spellStart"/>
-      <w:r>
-        <w:rPr>
-          <w:rFonts w:cs="Liberation Serif"/>
-        </w:rPr>
-        <w:t>Модуларни</w:t>
-      </w:r>
-      <w:proofErr w:type="spellEnd"/>
-      <w:r>
-        <w:rPr>
-          <w:rFonts w:cs="Liberation Serif"/>
-        </w:rPr>
-        <w:t xml:space="preserve"> </w:t>
-      </w:r>
-      <w:proofErr w:type="spellStart"/>
-      <w:r>
-        <w:rPr>
-          <w:rFonts w:cs="Liberation Serif"/>
-        </w:rPr>
-        <w:t>монолит</w:t>
-      </w:r>
-      <w:proofErr w:type="spellEnd"/>
-      <w:r>
-        <w:rPr>
-          <w:rFonts w:cs="Liberation Serif"/>
-        </w:rPr>
-        <w:t xml:space="preserve"> </w:t>
-      </w:r>
-      <w:proofErr w:type="spellStart"/>
-      <w:r>
-        <w:rPr>
-          <w:rFonts w:cs="Liberation Serif"/>
-        </w:rPr>
-        <w:t>са</w:t>
-      </w:r>
-      <w:proofErr w:type="spellEnd"/>
-      <w:r>
-        <w:rPr>
-          <w:rFonts w:cs="Liberation Serif"/>
-        </w:rPr>
-        <w:t xml:space="preserve"> </w:t>
-      </w:r>
-      <w:proofErr w:type="spellStart"/>
-      <w:r>
-        <w:rPr>
-          <w:rFonts w:cs="Liberation Serif"/>
-        </w:rPr>
-        <w:t>јасним</w:t>
-      </w:r>
-      <w:proofErr w:type="spellEnd"/>
-      <w:r>
-        <w:rPr>
-          <w:rFonts w:cs="Liberation Serif"/>
-        </w:rPr>
-        <w:t xml:space="preserve"> </w:t>
-      </w:r>
-      <w:proofErr w:type="spellStart"/>
-      <w:r>
-        <w:rPr>
-          <w:rFonts w:cs="Liberation Serif"/>
-        </w:rPr>
-        <w:t>границама</w:t>
-      </w:r>
-      <w:proofErr w:type="spellEnd"/>
       <w:r>
         <w:rPr>
           <w:rFonts w:cs="Liberation Serif"/>
@@ -1393,117 +1266,11 @@
         </w:rPr>
         <w:t>. Ф</w:t>
       </w:r>
-      <w:proofErr w:type="spellStart"/>
       <w:r>
         <w:rPr>
           <w:rFonts w:cs="Liberation Serif"/>
         </w:rPr>
-        <w:t>ункционалности</w:t>
-      </w:r>
-      <w:proofErr w:type="spellEnd"/>
-      <w:r>
-        <w:rPr>
-          <w:rFonts w:cs="Liberation Serif"/>
-        </w:rPr>
-        <w:t xml:space="preserve"> </w:t>
-      </w:r>
-      <w:proofErr w:type="spellStart"/>
-      <w:r>
-        <w:rPr>
-          <w:rFonts w:cs="Liberation Serif"/>
-        </w:rPr>
-        <w:t>се</w:t>
-      </w:r>
-      <w:proofErr w:type="spellEnd"/>
-      <w:r>
-        <w:rPr>
-          <w:rFonts w:cs="Liberation Serif"/>
-        </w:rPr>
-        <w:t xml:space="preserve"> </w:t>
-      </w:r>
-      <w:proofErr w:type="spellStart"/>
-      <w:r>
-        <w:rPr>
-          <w:rFonts w:cs="Liberation Serif"/>
-        </w:rPr>
-        <w:t>могу</w:t>
-      </w:r>
-      <w:proofErr w:type="spellEnd"/>
-      <w:r>
-        <w:rPr>
-          <w:rFonts w:cs="Liberation Serif"/>
-        </w:rPr>
-        <w:t xml:space="preserve"> </w:t>
-      </w:r>
-      <w:proofErr w:type="spellStart"/>
-      <w:r>
-        <w:rPr>
-          <w:rFonts w:cs="Liberation Serif"/>
-        </w:rPr>
-        <w:t>додавати</w:t>
-      </w:r>
-      <w:proofErr w:type="spellEnd"/>
-      <w:r>
-        <w:rPr>
-          <w:rFonts w:cs="Liberation Serif"/>
-        </w:rPr>
-        <w:t xml:space="preserve"> </w:t>
-      </w:r>
-      <w:proofErr w:type="spellStart"/>
-      <w:r>
-        <w:rPr>
-          <w:rFonts w:cs="Liberation Serif"/>
-        </w:rPr>
-        <w:t>без</w:t>
-      </w:r>
-      <w:proofErr w:type="spellEnd"/>
-      <w:r>
-        <w:rPr>
-          <w:rFonts w:cs="Liberation Serif"/>
-        </w:rPr>
-        <w:t xml:space="preserve"> </w:t>
-      </w:r>
-      <w:proofErr w:type="spellStart"/>
-      <w:r>
-        <w:rPr>
-          <w:rFonts w:cs="Liberation Serif"/>
-        </w:rPr>
-        <w:t>мењања</w:t>
-      </w:r>
-      <w:proofErr w:type="spellEnd"/>
-      <w:r>
-        <w:rPr>
-          <w:rFonts w:cs="Liberation Serif"/>
-        </w:rPr>
-        <w:t xml:space="preserve"> </w:t>
-      </w:r>
-      <w:proofErr w:type="spellStart"/>
-      <w:r>
-        <w:rPr>
-          <w:rFonts w:cs="Liberation Serif"/>
-        </w:rPr>
-        <w:t>туђег</w:t>
-      </w:r>
-      <w:proofErr w:type="spellEnd"/>
-      <w:r>
-        <w:rPr>
-          <w:rFonts w:cs="Liberation Serif"/>
-        </w:rPr>
-        <w:t xml:space="preserve"> </w:t>
-      </w:r>
-      <w:proofErr w:type="spellStart"/>
-      <w:r>
-        <w:rPr>
-          <w:rFonts w:cs="Liberation Serif"/>
-        </w:rPr>
-        <w:t>интерног</w:t>
-      </w:r>
-      <w:proofErr w:type="spellEnd"/>
-      <w:r>
-        <w:rPr>
-          <w:rFonts w:cs="Liberation Serif"/>
-        </w:rPr>
-        <w:t xml:space="preserve"> стања.</w:t>
+        <w:t>ункционалности се могу додавати без мењања туђег интерног стања.</w:t>
       </w:r>
     </w:p>
     <w:p>
@@ -1517,86 +1284,8 @@
         <w:rPr>
           <w:rFonts w:cs="Liberation Serif"/>
         </w:rPr>
-        <w:t xml:space="preserve">•  Изолација </w:t>
+        <w:t>•  Изолација корисничких података и провере дозвола на серверу</w:t>
       </w:r>
-      <w:proofErr w:type="spellStart"/>
-      <w:r>
-        <w:rPr>
-          <w:rFonts w:cs="Liberation Serif"/>
-        </w:rPr>
-        <w:t>корисничких</w:t>
-      </w:r>
-      <w:proofErr w:type="spellEnd"/>
-      <w:r>
-        <w:rPr>
-          <w:rFonts w:cs="Liberation Serif"/>
-        </w:rPr>
-        <w:t xml:space="preserve"> </w:t>
-      </w:r>
-      <w:proofErr w:type="spellStart"/>
-      <w:r>
-        <w:rPr>
-          <w:rFonts w:cs="Liberation Serif"/>
-        </w:rPr>
-        <w:t>података</w:t>
-      </w:r>
-      <w:proofErr w:type="spellEnd"/>
-      <w:r>
-        <w:rPr>
-          <w:rFonts w:cs="Liberation Serif"/>
-        </w:rPr>
-        <w:t xml:space="preserve"> и </w:t>
-      </w:r>
-      <w:proofErr w:type="spellStart"/>
-      <w:r>
-        <w:rPr>
-          <w:rFonts w:cs="Liberation Serif"/>
-        </w:rPr>
-        <w:t>провере</w:t>
-      </w:r>
-      <w:proofErr w:type="spellEnd"/>
-      <w:r>
-        <w:rPr>
-          <w:rFonts w:cs="Liberation Serif"/>
-        </w:rPr>
-        <w:t xml:space="preserve"> </w:t>
-      </w:r>
-      <w:proofErr w:type="spellStart"/>
-      <w:r>
-        <w:rPr>
-          <w:rFonts w:cs="Liberation Serif"/>
-        </w:rPr>
-        <w:t>дозвола</w:t>
-      </w:r>
-      <w:proofErr w:type="spellEnd"/>
-      <w:r>
-        <w:rPr>
-          <w:rFonts w:cs="Liberation Serif"/>
-        </w:rPr>
-        <w:t xml:space="preserve"> </w:t>
-      </w:r>
-      <w:proofErr w:type="spellStart"/>
-      <w:r>
-        <w:rPr>
-          <w:rFonts w:cs="Liberation Serif"/>
-        </w:rPr>
-        <w:t>на</w:t>
-      </w:r>
-      <w:proofErr w:type="spellEnd"/>
-      <w:r>
-        <w:rPr>
-          <w:rFonts w:cs="Liberation Serif"/>
-        </w:rPr>
-        <w:t xml:space="preserve"> </w:t>
-      </w:r>
-      <w:proofErr w:type="spellStart"/>
-      <w:r>
-        <w:rPr>
-          <w:rFonts w:cs="Liberation Serif"/>
-        </w:rPr>
-        <w:t>серверу</w:t>
-      </w:r>
-      <w:proofErr w:type="spellEnd"/>
       <w:r>
         <w:rPr>
           <w:rFonts w:cs="Liberation Serif"/>
@@ -1604,75 +1293,11 @@
         </w:rPr>
         <w:t>. К</w:t>
       </w:r>
-      <w:proofErr w:type="spellStart"/>
       <w:r>
         <w:rPr>
           <w:rFonts w:cs="Liberation Serif"/>
         </w:rPr>
-        <w:t>лијентски</w:t>
-      </w:r>
-      <w:proofErr w:type="spellEnd"/>
-      <w:r>
-        <w:rPr>
-          <w:rFonts w:cs="Liberation Serif"/>
-        </w:rPr>
-        <w:t xml:space="preserve"> </w:t>
-      </w:r>
-      <w:proofErr w:type="spellStart"/>
-      <w:r>
-        <w:rPr>
-          <w:rFonts w:cs="Liberation Serif"/>
-        </w:rPr>
-        <w:t>интерфејс</w:t>
-      </w:r>
-      <w:proofErr w:type="spellEnd"/>
-      <w:r>
-        <w:rPr>
-          <w:rFonts w:cs="Liberation Serif"/>
-        </w:rPr>
-        <w:t xml:space="preserve"> </w:t>
-      </w:r>
-      <w:proofErr w:type="spellStart"/>
-      <w:r>
-        <w:rPr>
-          <w:rFonts w:cs="Liberation Serif"/>
-        </w:rPr>
-        <w:t>није</w:t>
-      </w:r>
-      <w:proofErr w:type="spellEnd"/>
-      <w:r>
-        <w:rPr>
-          <w:rFonts w:cs="Liberation Serif"/>
-        </w:rPr>
-        <w:t xml:space="preserve"> </w:t>
-      </w:r>
-      <w:proofErr w:type="spellStart"/>
-      <w:r>
-        <w:rPr>
-          <w:rFonts w:cs="Liberation Serif"/>
-        </w:rPr>
-        <w:t>безбедносна</w:t>
-      </w:r>
-      <w:proofErr w:type="spellEnd"/>
-      <w:r>
-        <w:rPr>
-          <w:rFonts w:cs="Liberation Serif"/>
-        </w:rPr>
-        <w:t xml:space="preserve"> </w:t>
-      </w:r>
-      <w:proofErr w:type="spellStart"/>
-      <w:r>
-        <w:rPr>
-          <w:rFonts w:cs="Liberation Serif"/>
-        </w:rPr>
-        <w:t>граница</w:t>
-      </w:r>
-      <w:proofErr w:type="spellEnd"/>
-      <w:r>
-        <w:rPr>
-          <w:rFonts w:cs="Liberation Serif"/>
-        </w:rPr>
-        <w:t>.</w:t>
+        <w:t>лијентски интерфејс није безбедносна граница.</w:t>
       </w:r>
     </w:p>
     <w:p>
@@ -2108,63 +1733,7 @@
         <w:rPr>
           <w:rFonts w:cs="Liberation Serif"/>
         </w:rPr>
-        <w:t xml:space="preserve">Ознаке Ј/П/Н разликују основне, проширене и инфраструктурно захтевније функционалности. Оне описују зависности између захтева и не мењају правила приступа </w:t>
-      </w:r>
-      <w:proofErr w:type="spellStart"/>
-      <w:r>
-        <w:rPr>
-          <w:rFonts w:cs="Liberation Serif"/>
-        </w:rPr>
-        <w:t>или</w:t>
-      </w:r>
-      <w:proofErr w:type="spellEnd"/>
-      <w:r>
-        <w:rPr>
-          <w:rFonts w:cs="Liberation Serif"/>
-        </w:rPr>
-        <w:t xml:space="preserve"> </w:t>
-      </w:r>
-      <w:proofErr w:type="spellStart"/>
-      <w:r>
-        <w:rPr>
-          <w:rFonts w:cs="Liberation Serif"/>
-        </w:rPr>
-        <w:t>уговоре</w:t>
-      </w:r>
-      <w:proofErr w:type="spellEnd"/>
-      <w:r>
-        <w:rPr>
-          <w:rFonts w:cs="Liberation Serif"/>
-        </w:rPr>
-        <w:t xml:space="preserve"> </w:t>
-      </w:r>
-      <w:proofErr w:type="spellStart"/>
-      <w:r>
-        <w:rPr>
-          <w:rFonts w:cs="Liberation Serif"/>
-        </w:rPr>
-        <w:t>постојећих</w:t>
-      </w:r>
-      <w:proofErr w:type="spellEnd"/>
-      <w:r>
-        <w:rPr>
-          <w:rFonts w:cs="Liberation Serif"/>
-        </w:rPr>
-        <w:t xml:space="preserve"> </w:t>
-      </w:r>
-      <w:proofErr w:type="spellStart"/>
-      <w:r>
-        <w:rPr>
-          <w:rFonts w:cs="Liberation Serif"/>
-        </w:rPr>
-        <w:t>модула</w:t>
-      </w:r>
-      <w:proofErr w:type="spellEnd"/>
-      <w:r>
-        <w:rPr>
-          <w:rFonts w:cs="Liberation Serif"/>
-        </w:rPr>
-        <w:t>.</w:t>
+        <w:t>Ознаке Ј/П/Н разликују основне, проширене и инфраструктурно захтевније функционалности. Оне описују зависности између захтева и не мењају правила приступа или уговоре постојећих модула.</w:t>
       </w:r>
     </w:p>
     <w:p>
@@ -2181,31 +1750,9 @@
           <w:rFonts w:ascii="Liberation Serif" w:hAnsi="Liberation Serif" w:cs="Liberation Serif"/>
         </w:rPr>
         <w:lastRenderedPageBreak/>
-        <w:t xml:space="preserve">2 Корисници, </w:t>
-      </w:r>
-      <w:proofErr w:type="spellStart"/>
-      <w:r>
-        <w:rPr>
-          <w:rFonts w:ascii="Liberation Serif" w:hAnsi="Liberation Serif" w:cs="Liberation Serif"/>
-        </w:rPr>
-        <w:t>сценарији</w:t>
-      </w:r>
-      <w:proofErr w:type="spellEnd"/>
-      <w:r>
-        <w:rPr>
-          <w:rFonts w:ascii="Liberation Serif" w:hAnsi="Liberation Serif" w:cs="Liberation Serif"/>
-        </w:rPr>
-        <w:t xml:space="preserve"> и </w:t>
-      </w:r>
-      <w:proofErr w:type="spellStart"/>
-      <w:r>
-        <w:rPr>
-          <w:rFonts w:ascii="Liberation Serif" w:hAnsi="Liberation Serif" w:cs="Liberation Serif"/>
-        </w:rPr>
-        <w:t>права</w:t>
+        <w:t>2 Корисници, сценарији и права</w:t>
       </w:r>
       <w:bookmarkEnd w:id="3"/>
-      <w:proofErr w:type="spellEnd"/>
     </w:p>
     <w:p>
       <w:pPr>
@@ -2350,143 +1897,13 @@
                 <w:rFonts w:cs="Liberation Serif"/>
               </w:rPr>
             </w:pPr>
-            <w:proofErr w:type="spellStart"/>
-            <w:r>
-              <w:rPr>
-                <w:rFonts w:cs="Liberation Serif"/>
-                <w:sz w:val="18"/>
-              </w:rPr>
-              <w:t>Преглед</w:t>
-            </w:r>
-            <w:proofErr w:type="spellEnd"/>
-            <w:r>
-              <w:rPr>
-                <w:rFonts w:cs="Liberation Serif"/>
-                <w:sz w:val="18"/>
-              </w:rPr>
-              <w:t xml:space="preserve"> </w:t>
-            </w:r>
-            <w:proofErr w:type="spellStart"/>
-            <w:r>
-              <w:rPr>
-                <w:rFonts w:cs="Liberation Serif"/>
-                <w:sz w:val="18"/>
-              </w:rPr>
-              <w:t>јавног</w:t>
-            </w:r>
-            <w:proofErr w:type="spellEnd"/>
-            <w:r>
-              <w:rPr>
-                <w:rFonts w:cs="Liberation Serif"/>
-                <w:sz w:val="18"/>
-              </w:rPr>
-              <w:t xml:space="preserve"> </w:t>
-            </w:r>
-            <w:proofErr w:type="spellStart"/>
-            <w:r>
-              <w:rPr>
-                <w:rFonts w:cs="Liberation Serif"/>
-                <w:sz w:val="18"/>
-              </w:rPr>
-              <w:t>описа</w:t>
-            </w:r>
-            <w:proofErr w:type="spellEnd"/>
-            <w:r>
-              <w:rPr>
-                <w:rFonts w:cs="Liberation Serif"/>
-                <w:sz w:val="18"/>
-              </w:rPr>
-              <w:t xml:space="preserve"> </w:t>
-            </w:r>
-            <w:proofErr w:type="spellStart"/>
-            <w:r>
-              <w:rPr>
-                <w:rFonts w:cs="Liberation Serif"/>
-                <w:sz w:val="18"/>
-              </w:rPr>
-              <w:t>платформе</w:t>
-            </w:r>
-            <w:proofErr w:type="spellEnd"/>
-            <w:r>
-              <w:rPr>
-                <w:rFonts w:cs="Liberation Serif"/>
-                <w:sz w:val="18"/>
-              </w:rPr>
-              <w:t xml:space="preserve"> и </w:t>
-            </w:r>
-            <w:proofErr w:type="spellStart"/>
-            <w:r>
-              <w:rPr>
-                <w:rFonts w:cs="Liberation Serif"/>
-                <w:sz w:val="18"/>
-              </w:rPr>
-              <w:t>ако</w:t>
-            </w:r>
-            <w:proofErr w:type="spellEnd"/>
-            <w:r>
-              <w:rPr>
-                <w:rFonts w:cs="Liberation Serif"/>
-                <w:sz w:val="18"/>
-              </w:rPr>
-              <w:t xml:space="preserve"> </w:t>
-            </w:r>
-            <w:proofErr w:type="spellStart"/>
-            <w:r>
-              <w:rPr>
-                <w:rFonts w:cs="Liberation Serif"/>
-                <w:sz w:val="18"/>
-              </w:rPr>
-              <w:t>је</w:t>
-            </w:r>
-            <w:proofErr w:type="spellEnd"/>
-            <w:r>
-              <w:rPr>
-                <w:rFonts w:cs="Liberation Serif"/>
-                <w:sz w:val="18"/>
-              </w:rPr>
-              <w:t xml:space="preserve"> </w:t>
-            </w:r>
-            <w:proofErr w:type="spellStart"/>
-            <w:r>
-              <w:rPr>
-                <w:rFonts w:cs="Liberation Serif"/>
-                <w:sz w:val="18"/>
-              </w:rPr>
-              <w:t>дозвољено</w:t>
-            </w:r>
-            <w:proofErr w:type="spellEnd"/>
-            <w:r>
-              <w:rPr>
-                <w:rFonts w:cs="Liberation Serif"/>
-                <w:sz w:val="18"/>
-              </w:rPr>
-              <w:t xml:space="preserve">, </w:t>
-            </w:r>
-            <w:proofErr w:type="spellStart"/>
-            <w:r>
-              <w:rPr>
-                <w:rFonts w:cs="Liberation Serif"/>
-                <w:sz w:val="18"/>
-              </w:rPr>
-              <w:t>јавног</w:t>
-            </w:r>
-            <w:proofErr w:type="spellEnd"/>
-            <w:r>
-              <w:rPr>
-                <w:rFonts w:cs="Liberation Serif"/>
-                <w:sz w:val="18"/>
-              </w:rPr>
-              <w:t xml:space="preserve"> </w:t>
-            </w:r>
-            <w:proofErr w:type="spellStart"/>
-            <w:r>
-              <w:rPr>
-                <w:rFonts w:cs="Liberation Serif"/>
-                <w:sz w:val="18"/>
-              </w:rPr>
-              <w:t>каталога</w:t>
-            </w:r>
-            <w:proofErr w:type="spellEnd"/>
+            <w:r>
+              <w:rPr>
+                <w:rFonts w:cs="Liberation Serif"/>
+                <w:sz w:val="18"/>
+              </w:rPr>
+              <w:t>Преглед јавног описа платформе и ако је дозвољено, јавног каталога</w:t>
+            </w:r>
             <w:r>
               <w:rPr>
                 <w:rFonts w:cs="Liberation Serif"/>
@@ -2495,85 +1912,12 @@
               </w:rPr>
               <w:t xml:space="preserve">: </w:t>
             </w:r>
-            <w:proofErr w:type="spellStart"/>
-            <w:r>
-              <w:rPr>
-                <w:rFonts w:cs="Liberation Serif"/>
-                <w:sz w:val="18"/>
-              </w:rPr>
-              <w:t>без</w:t>
-            </w:r>
-            <w:proofErr w:type="spellEnd"/>
-            <w:r>
-              <w:rPr>
-                <w:rFonts w:cs="Liberation Serif"/>
-                <w:sz w:val="18"/>
-              </w:rPr>
-              <w:t xml:space="preserve"> </w:t>
-            </w:r>
-            <w:proofErr w:type="spellStart"/>
-            <w:r>
-              <w:rPr>
-                <w:rFonts w:cs="Liberation Serif"/>
-                <w:sz w:val="18"/>
-              </w:rPr>
-              <w:t>приступа</w:t>
-            </w:r>
-            <w:proofErr w:type="spellEnd"/>
-            <w:r>
-              <w:rPr>
-                <w:rFonts w:cs="Liberation Serif"/>
-                <w:sz w:val="18"/>
-              </w:rPr>
-              <w:t xml:space="preserve"> </w:t>
-            </w:r>
-            <w:proofErr w:type="spellStart"/>
-            <w:r>
-              <w:rPr>
-                <w:rFonts w:cs="Liberation Serif"/>
-                <w:sz w:val="18"/>
-              </w:rPr>
-              <w:t>одговорима</w:t>
-            </w:r>
-            <w:proofErr w:type="spellEnd"/>
-            <w:r>
-              <w:rPr>
-                <w:rFonts w:cs="Liberation Serif"/>
-                <w:sz w:val="18"/>
-              </w:rPr>
-              <w:t xml:space="preserve"> и </w:t>
-            </w:r>
-            <w:proofErr w:type="spellStart"/>
-            <w:r>
-              <w:rPr>
-                <w:rFonts w:cs="Liberation Serif"/>
-                <w:sz w:val="18"/>
-              </w:rPr>
-              <w:t>личним</w:t>
-            </w:r>
-            <w:proofErr w:type="spellEnd"/>
-            <w:r>
-              <w:rPr>
-                <w:rFonts w:cs="Liberation Serif"/>
-                <w:sz w:val="18"/>
-              </w:rPr>
-              <w:t xml:space="preserve"> </w:t>
-            </w:r>
-            <w:proofErr w:type="spellStart"/>
-            <w:r>
-              <w:rPr>
-                <w:rFonts w:cs="Liberation Serif"/>
-                <w:sz w:val="18"/>
-              </w:rPr>
-              <w:t>подацима</w:t>
-            </w:r>
-            <w:proofErr w:type="spellEnd"/>
-            <w:r>
-              <w:rPr>
-                <w:rFonts w:cs="Liberation Serif"/>
-                <w:sz w:val="18"/>
-              </w:rPr>
-              <w:t>.</w:t>
+            <w:r>
+              <w:rPr>
+                <w:rFonts w:cs="Liberation Serif"/>
+                <w:sz w:val="18"/>
+              </w:rPr>
+              <w:t>без приступа одговорима и личним подацима.</w:t>
             </w:r>
           </w:p>
         </w:tc>
@@ -2630,15 +1974,36 @@
                 <w:rFonts w:cs="Liberation Serif"/>
               </w:rPr>
             </w:pPr>
-            <w:proofErr w:type="spellStart"/>
-            <w:r>
-              <w:rPr>
-                <w:rFonts w:cs="Liberation Serif"/>
-                <w:sz w:val="18"/>
-              </w:rPr>
-              <w:t>Преглед</w:t>
-            </w:r>
-            <w:proofErr w:type="spellEnd"/>
+            <w:r>
+              <w:rPr>
+                <w:rFonts w:cs="Liberation Serif"/>
+                <w:sz w:val="18"/>
+              </w:rPr>
+              <w:t>Преглед додељених лабораторија</w:t>
+            </w:r>
+            <w:r>
+              <w:rPr>
+                <w:rFonts w:cs="Liberation Serif"/>
+                <w:sz w:val="18"/>
+                <w:lang w:val="sr-Cyrl-RS"/>
+              </w:rPr>
+              <w:t>:</w:t>
+            </w:r>
+            <w:r>
+              <w:rPr>
+                <w:rFonts w:cs="Liberation Serif"/>
+                <w:sz w:val="18"/>
+              </w:rPr>
+              <w:t xml:space="preserve"> покретање, решавање и предаја сопствених покушаја</w:t>
+            </w:r>
+            <w:r>
+              <w:rPr>
+                <w:rFonts w:cs="Liberation Serif"/>
+                <w:sz w:val="18"/>
+                <w:lang w:val="sr-Cyrl-RS"/>
+              </w:rPr>
+              <w:t>.</w:t>
+            </w:r>
             <w:r>
               <w:rPr>
                 <w:rFonts w:cs="Liberation Serif"/>
@@ -2646,157 +2011,20 @@
               </w:rPr>
               <w:t xml:space="preserve"> </w:t>
             </w:r>
-            <w:proofErr w:type="spellStart"/>
-            <w:r>
-              <w:rPr>
-                <w:rFonts w:cs="Liberation Serif"/>
-                <w:sz w:val="18"/>
-              </w:rPr>
-              <w:t>додељених</w:t>
-            </w:r>
-            <w:proofErr w:type="spellEnd"/>
-            <w:r>
-              <w:rPr>
-                <w:rFonts w:cs="Liberation Serif"/>
-                <w:sz w:val="18"/>
-              </w:rPr>
-              <w:t xml:space="preserve"> </w:t>
-            </w:r>
-            <w:proofErr w:type="spellStart"/>
-            <w:r>
-              <w:rPr>
-                <w:rFonts w:cs="Liberation Serif"/>
-                <w:sz w:val="18"/>
-              </w:rPr>
-              <w:t>лабораторија</w:t>
-            </w:r>
-            <w:proofErr w:type="spellEnd"/>
             <w:r>
               <w:rPr>
                 <w:rFonts w:cs="Liberation Serif"/>
                 <w:sz w:val="18"/>
                 <w:lang w:val="sr-Cyrl-RS"/>
               </w:rPr>
-              <w:t>:</w:t>
-            </w:r>
-            <w:r>
-              <w:rPr>
-                <w:rFonts w:cs="Liberation Serif"/>
-                <w:sz w:val="18"/>
-              </w:rPr>
-              <w:t xml:space="preserve"> покретање, решавање и </w:t>
-            </w:r>
-            <w:proofErr w:type="spellStart"/>
-            <w:r>
-              <w:rPr>
-                <w:rFonts w:cs="Liberation Serif"/>
-                <w:sz w:val="18"/>
-              </w:rPr>
-              <w:t>предаја</w:t>
-            </w:r>
-            <w:proofErr w:type="spellEnd"/>
-            <w:r>
-              <w:rPr>
-                <w:rFonts w:cs="Liberation Serif"/>
-                <w:sz w:val="18"/>
-              </w:rPr>
-              <w:t xml:space="preserve"> </w:t>
-            </w:r>
-            <w:proofErr w:type="spellStart"/>
-            <w:r>
-              <w:rPr>
-                <w:rFonts w:cs="Liberation Serif"/>
-                <w:sz w:val="18"/>
-              </w:rPr>
-              <w:t>сопствених</w:t>
-            </w:r>
-            <w:proofErr w:type="spellEnd"/>
-            <w:r>
-              <w:rPr>
-                <w:rFonts w:cs="Liberation Serif"/>
-                <w:sz w:val="18"/>
-              </w:rPr>
-              <w:t xml:space="preserve"> </w:t>
-            </w:r>
-            <w:proofErr w:type="spellStart"/>
-            <w:r>
-              <w:rPr>
-                <w:rFonts w:cs="Liberation Serif"/>
-                <w:sz w:val="18"/>
-              </w:rPr>
-              <w:t>покушаја</w:t>
-            </w:r>
-            <w:proofErr w:type="spellEnd"/>
-            <w:r>
-              <w:rPr>
-                <w:rFonts w:cs="Liberation Serif"/>
-                <w:sz w:val="18"/>
-                <w:lang w:val="sr-Cyrl-RS"/>
-              </w:rPr>
-              <w:t>.</w:t>
-            </w:r>
-            <w:r>
-              <w:rPr>
-                <w:rFonts w:cs="Liberation Serif"/>
-                <w:sz w:val="18"/>
-              </w:rPr>
-              <w:t xml:space="preserve"> </w:t>
-            </w:r>
-            <w:r>
-              <w:rPr>
-                <w:rFonts w:cs="Liberation Serif"/>
-                <w:sz w:val="18"/>
-                <w:lang w:val="sr-Cyrl-RS"/>
-              </w:rPr>
               <w:t>У</w:t>
             </w:r>
-            <w:proofErr w:type="spellStart"/>
-            <w:r>
-              <w:rPr>
-                <w:rFonts w:cs="Liberation Serif"/>
-                <w:sz w:val="18"/>
-              </w:rPr>
-              <w:t>вид</w:t>
-            </w:r>
-            <w:proofErr w:type="spellEnd"/>
-            <w:r>
-              <w:rPr>
-                <w:rFonts w:cs="Liberation Serif"/>
-                <w:sz w:val="18"/>
-              </w:rPr>
-              <w:t xml:space="preserve"> у </w:t>
-            </w:r>
-            <w:proofErr w:type="spellStart"/>
-            <w:r>
-              <w:rPr>
-                <w:rFonts w:cs="Liberation Serif"/>
-                <w:sz w:val="18"/>
-              </w:rPr>
-              <w:t>дозвољену</w:t>
-            </w:r>
-            <w:proofErr w:type="spellEnd"/>
-            <w:r>
-              <w:rPr>
-                <w:rFonts w:cs="Liberation Serif"/>
-                <w:sz w:val="18"/>
-              </w:rPr>
-              <w:t xml:space="preserve"> </w:t>
-            </w:r>
-            <w:proofErr w:type="spellStart"/>
-            <w:r>
-              <w:rPr>
-                <w:rFonts w:cs="Liberation Serif"/>
-                <w:sz w:val="18"/>
-              </w:rPr>
-              <w:t>повратну</w:t>
-            </w:r>
-            <w:proofErr w:type="spellEnd"/>
-            <w:r>
-              <w:rPr>
-                <w:rFonts w:cs="Liberation Serif"/>
-                <w:sz w:val="18"/>
-              </w:rPr>
-              <w:t xml:space="preserve"> информацију.</w:t>
+            <w:r>
+              <w:rPr>
+                <w:rFonts w:cs="Liberation Serif"/>
+                <w:sz w:val="18"/>
+              </w:rPr>
+              <w:t>вид у дозвољену повратну информацију.</w:t>
             </w:r>
           </w:p>
         </w:tc>
@@ -2858,33 +2086,16 @@
                 <w:rFonts w:cs="Liberation Serif"/>
                 <w:sz w:val="18"/>
               </w:rPr>
-              <w:t xml:space="preserve">Управљање додељеним курсевима, </w:t>
-            </w:r>
-            <w:proofErr w:type="spellStart"/>
-            <w:r>
-              <w:rPr>
-                <w:rFonts w:cs="Liberation Serif"/>
-                <w:sz w:val="18"/>
-              </w:rPr>
-              <w:t>лабораторијама</w:t>
-            </w:r>
-            <w:proofErr w:type="spellEnd"/>
-            <w:r>
-              <w:rPr>
-                <w:rFonts w:cs="Liberation Serif"/>
-                <w:sz w:val="18"/>
-              </w:rPr>
-              <w:t xml:space="preserve"> и </w:t>
-            </w:r>
-            <w:proofErr w:type="spellStart"/>
-            <w:r>
-              <w:rPr>
-                <w:rFonts w:cs="Liberation Serif"/>
-                <w:sz w:val="18"/>
-              </w:rPr>
-              <w:t>њиховим</w:t>
-            </w:r>
-            <w:proofErr w:type="spellEnd"/>
+              <w:t>Управљање додељеним курсевима, лабораторијама и њиховим ревизијама</w:t>
+            </w:r>
+            <w:r>
+              <w:rPr>
+                <w:rFonts w:cs="Liberation Serif"/>
+                <w:sz w:val="18"/>
+                <w:lang w:val="sr-Cyrl-RS"/>
+              </w:rPr>
+              <w:t>.</w:t>
+            </w:r>
             <w:r>
               <w:rPr>
                 <w:rFonts w:cs="Liberation Serif"/>
@@ -2892,101 +2103,20 @@
               </w:rPr>
               <w:t xml:space="preserve"> </w:t>
             </w:r>
-            <w:proofErr w:type="spellStart"/>
-            <w:r>
-              <w:rPr>
-                <w:rFonts w:cs="Liberation Serif"/>
-                <w:sz w:val="18"/>
-              </w:rPr>
-              <w:t>ревизијама</w:t>
-            </w:r>
-            <w:proofErr w:type="spellEnd"/>
             <w:r>
               <w:rPr>
                 <w:rFonts w:cs="Liberation Serif"/>
                 <w:sz w:val="18"/>
                 <w:lang w:val="sr-Cyrl-RS"/>
               </w:rPr>
-              <w:t>.</w:t>
-            </w:r>
-            <w:r>
-              <w:rPr>
-                <w:rFonts w:cs="Liberation Serif"/>
-                <w:sz w:val="18"/>
-              </w:rPr>
-              <w:t xml:space="preserve"> </w:t>
-            </w:r>
-            <w:r>
-              <w:rPr>
-                <w:rFonts w:cs="Liberation Serif"/>
-                <w:sz w:val="18"/>
-                <w:lang w:val="sr-Cyrl-RS"/>
-              </w:rPr>
               <w:t>П</w:t>
             </w:r>
-            <w:proofErr w:type="spellStart"/>
-            <w:r>
-              <w:rPr>
-                <w:rFonts w:cs="Liberation Serif"/>
-                <w:sz w:val="18"/>
-              </w:rPr>
-              <w:t>реглед</w:t>
-            </w:r>
-            <w:proofErr w:type="spellEnd"/>
-            <w:r>
-              <w:rPr>
-                <w:rFonts w:cs="Liberation Serif"/>
-                <w:sz w:val="18"/>
-              </w:rPr>
-              <w:t xml:space="preserve"> </w:t>
-            </w:r>
-            <w:proofErr w:type="spellStart"/>
-            <w:r>
-              <w:rPr>
-                <w:rFonts w:cs="Liberation Serif"/>
-                <w:sz w:val="18"/>
-              </w:rPr>
-              <w:t>покушаја</w:t>
-            </w:r>
-            <w:proofErr w:type="spellEnd"/>
-            <w:r>
-              <w:rPr>
-                <w:rFonts w:cs="Liberation Serif"/>
-                <w:sz w:val="18"/>
-              </w:rPr>
-              <w:t xml:space="preserve"> </w:t>
-            </w:r>
-            <w:proofErr w:type="spellStart"/>
-            <w:r>
-              <w:rPr>
-                <w:rFonts w:cs="Liberation Serif"/>
-                <w:sz w:val="18"/>
-              </w:rPr>
-              <w:t>уписаних</w:t>
-            </w:r>
-            <w:proofErr w:type="spellEnd"/>
-            <w:r>
-              <w:rPr>
-                <w:rFonts w:cs="Liberation Serif"/>
-                <w:sz w:val="18"/>
-              </w:rPr>
-              <w:t xml:space="preserve"> </w:t>
-            </w:r>
-            <w:proofErr w:type="spellStart"/>
-            <w:r>
-              <w:rPr>
-                <w:rFonts w:cs="Liberation Serif"/>
-                <w:sz w:val="18"/>
-              </w:rPr>
-              <w:t>студената</w:t>
-            </w:r>
-            <w:proofErr w:type="spellEnd"/>
-            <w:r>
-              <w:rPr>
-                <w:rFonts w:cs="Liberation Serif"/>
-                <w:sz w:val="18"/>
-              </w:rPr>
-              <w:t xml:space="preserve"> и ручна евалуација.</w:t>
+            <w:r>
+              <w:rPr>
+                <w:rFonts w:cs="Liberation Serif"/>
+                <w:sz w:val="18"/>
+              </w:rPr>
+              <w:t>реглед покушаја уписаних студената и ручна евалуација.</w:t>
             </w:r>
           </w:p>
         </w:tc>
@@ -3110,33 +2240,16 @@
                 <w:rFonts w:cs="Liberation Serif"/>
                 <w:sz w:val="18"/>
               </w:rPr>
-              <w:t xml:space="preserve">Конфигурација система, управљање </w:t>
-            </w:r>
-            <w:proofErr w:type="spellStart"/>
-            <w:r>
-              <w:rPr>
-                <w:rFonts w:cs="Liberation Serif"/>
-                <w:sz w:val="18"/>
-              </w:rPr>
-              <w:t>налозима</w:t>
-            </w:r>
-            <w:proofErr w:type="spellEnd"/>
-            <w:r>
-              <w:rPr>
-                <w:rFonts w:cs="Liberation Serif"/>
-                <w:sz w:val="18"/>
-              </w:rPr>
-              <w:t xml:space="preserve"> и </w:t>
-            </w:r>
-            <w:proofErr w:type="spellStart"/>
-            <w:r>
-              <w:rPr>
-                <w:rFonts w:cs="Liberation Serif"/>
-                <w:sz w:val="18"/>
-              </w:rPr>
-              <w:t>техничким</w:t>
-            </w:r>
-            <w:proofErr w:type="spellEnd"/>
+              <w:t>Конфигурација система, управљање налозима и техничким стањем</w:t>
+            </w:r>
+            <w:r>
+              <w:rPr>
+                <w:rFonts w:cs="Liberation Serif"/>
+                <w:sz w:val="18"/>
+                <w:lang w:val="sr-Cyrl-RS"/>
+              </w:rPr>
+              <w:t>.</w:t>
+            </w:r>
             <w:r>
               <w:rPr>
                 <w:rFonts w:cs="Liberation Serif"/>
@@ -3144,101 +2257,20 @@
               </w:rPr>
               <w:t xml:space="preserve"> </w:t>
             </w:r>
-            <w:proofErr w:type="spellStart"/>
-            <w:r>
-              <w:rPr>
-                <w:rFonts w:cs="Liberation Serif"/>
-                <w:sz w:val="18"/>
-              </w:rPr>
-              <w:t>стањем</w:t>
-            </w:r>
-            <w:proofErr w:type="spellEnd"/>
             <w:r>
               <w:rPr>
                 <w:rFonts w:cs="Liberation Serif"/>
                 <w:sz w:val="18"/>
                 <w:lang w:val="sr-Cyrl-RS"/>
               </w:rPr>
-              <w:t>.</w:t>
-            </w:r>
-            <w:r>
-              <w:rPr>
-                <w:rFonts w:cs="Liberation Serif"/>
-                <w:sz w:val="18"/>
-              </w:rPr>
-              <w:t xml:space="preserve"> </w:t>
-            </w:r>
-            <w:r>
-              <w:rPr>
-                <w:rFonts w:cs="Liberation Serif"/>
-                <w:sz w:val="18"/>
-                <w:lang w:val="sr-Cyrl-RS"/>
-              </w:rPr>
               <w:t>П</w:t>
             </w:r>
-            <w:proofErr w:type="spellStart"/>
-            <w:r>
-              <w:rPr>
-                <w:rFonts w:cs="Liberation Serif"/>
-                <w:sz w:val="18"/>
-              </w:rPr>
-              <w:t>риступ</w:t>
-            </w:r>
-            <w:proofErr w:type="spellEnd"/>
-            <w:r>
-              <w:rPr>
-                <w:rFonts w:cs="Liberation Serif"/>
-                <w:sz w:val="18"/>
-              </w:rPr>
-              <w:t xml:space="preserve"> </w:t>
-            </w:r>
-            <w:proofErr w:type="spellStart"/>
-            <w:r>
-              <w:rPr>
-                <w:rFonts w:cs="Liberation Serif"/>
-                <w:sz w:val="18"/>
-              </w:rPr>
-              <w:t>осетљивим</w:t>
-            </w:r>
-            <w:proofErr w:type="spellEnd"/>
-            <w:r>
-              <w:rPr>
-                <w:rFonts w:cs="Liberation Serif"/>
-                <w:sz w:val="18"/>
-              </w:rPr>
-              <w:t xml:space="preserve"> </w:t>
-            </w:r>
-            <w:proofErr w:type="spellStart"/>
-            <w:r>
-              <w:rPr>
-                <w:rFonts w:cs="Liberation Serif"/>
-                <w:sz w:val="18"/>
-              </w:rPr>
-              <w:t>резултатима</w:t>
-            </w:r>
-            <w:proofErr w:type="spellEnd"/>
-            <w:r>
-              <w:rPr>
-                <w:rFonts w:cs="Liberation Serif"/>
-                <w:sz w:val="18"/>
-              </w:rPr>
-              <w:t xml:space="preserve"> </w:t>
-            </w:r>
-            <w:proofErr w:type="spellStart"/>
-            <w:r>
-              <w:rPr>
-                <w:rFonts w:cs="Liberation Serif"/>
-                <w:sz w:val="18"/>
-              </w:rPr>
-              <w:t>само</w:t>
-            </w:r>
-            <w:proofErr w:type="spellEnd"/>
-            <w:r>
-              <w:rPr>
-                <w:rFonts w:cs="Liberation Serif"/>
-                <w:sz w:val="18"/>
-              </w:rPr>
-              <w:t xml:space="preserve"> уз посебну, евидентирану дозволу.</w:t>
+            <w:r>
+              <w:rPr>
+                <w:rFonts w:cs="Liberation Serif"/>
+                <w:sz w:val="18"/>
+              </w:rPr>
+              <w:t>риступ осетљивим резултатима само уз посебну, евидентирану дозволу.</w:t>
             </w:r>
           </w:p>
         </w:tc>
@@ -3415,7 +2447,7 @@
           <w:noProof/>
         </w:rPr>
         <w:drawing>
-          <wp:inline distT="0" distB="0" distL="0" distR="0" wp14:anchorId="6A7C327F" wp14:editId="39AA271A">
+          <wp:inline distT="0" distB="0" distL="0" distR="0" wp14:anchorId="7F60E75C" wp14:editId="4398BDFE">
             <wp:extent cx="5652000" cy="2537451"/>
             <wp:effectExtent l="0" t="0" r="0" b="0"/>
             <wp:docPr id="27" name="Picture 27"/>
@@ -3458,6 +2490,15 @@
         <w:rPr>
           <w:rFonts w:cs="Liberation Serif"/>
         </w:rPr>
+        <w:sectPr>
+          <w:headerReference w:type="default" r:id="rId13"/>
+          <w:footerReference w:type="default" r:id="rId14"/>
+          <w:pgSz w:w="11906" w:h="16838"/>
+          <w:pgMar w:top="1389" w:right="1389" w:bottom="1219" w:left="1446" w:header="652" w:footer="680" w:gutter="0"/>
+          <w:pgNumType w:start="1"/>
+          <w:cols w:space="720"/>
+          <w:docGrid w:linePitch="360"/>
+        </w:sectPr>
       </w:pPr>
       <w:r>
         <w:rPr>
@@ -3469,7 +2510,6 @@
     <w:p>
       <w:pPr>
         <w:pStyle w:val="Heading1"/>
-        <w:pageBreakBefore/>
         <w:rPr>
           <w:rFonts w:ascii="Liberation Serif" w:hAnsi="Liberation Serif" w:cs="Liberation Serif"/>
         </w:rPr>
@@ -3495,49 +2535,7 @@
         <w:rPr>
           <w:rFonts w:cs="Liberation Serif"/>
         </w:rPr>
-        <w:t xml:space="preserve">Систем је организован као модуларни монолит. Серверска апликација садржи логички изоловане модуле који комуницирају преко јасних интерфејса и контролисаног приступа подацима. Сваки модул чува сопствене инваријанте. Издвајање појединачног модула у засебан процес дозвољено је само уз очуване </w:t>
-      </w:r>
-      <w:proofErr w:type="spellStart"/>
-      <w:r>
-        <w:rPr>
-          <w:rFonts w:cs="Liberation Serif"/>
-        </w:rPr>
-        <w:t>уговоре</w:t>
-      </w:r>
-      <w:proofErr w:type="spellEnd"/>
-      <w:r>
-        <w:rPr>
-          <w:rFonts w:cs="Liberation Serif"/>
-        </w:rPr>
-        <w:t xml:space="preserve"> и </w:t>
-      </w:r>
-      <w:proofErr w:type="spellStart"/>
-      <w:r>
-        <w:rPr>
-          <w:rFonts w:cs="Liberation Serif"/>
-        </w:rPr>
-        <w:t>безбедносне</w:t>
-      </w:r>
-      <w:proofErr w:type="spellEnd"/>
-      <w:r>
-        <w:rPr>
-          <w:rFonts w:cs="Liberation Serif"/>
-        </w:rPr>
-        <w:t xml:space="preserve"> </w:t>
-      </w:r>
-      <w:proofErr w:type="spellStart"/>
-      <w:r>
-        <w:rPr>
-          <w:rFonts w:cs="Liberation Serif"/>
-        </w:rPr>
-        <w:t>границе</w:t>
-      </w:r>
-      <w:proofErr w:type="spellEnd"/>
-      <w:r>
-        <w:rPr>
-          <w:rFonts w:cs="Liberation Serif"/>
-        </w:rPr>
-        <w:t>.</w:t>
+        <w:t>Систем је организован као модуларни монолит. Серверска апликација садржи логички изоловане модуле који комуницирају преко јасних интерфејса и контролисаног приступа подацима. Сваки модул чува сопствене инваријанте. Издвајање појединачног модула у засебан процес дозвољено је само уз очуване уговоре и безбедносне границе.</w:t>
       </w:r>
     </w:p>
     <w:p>
@@ -3555,7 +2553,7 @@
           <w:noProof/>
         </w:rPr>
         <w:drawing>
-          <wp:inline distT="0" distB="0" distL="0" distR="0" wp14:anchorId="4FAAD8AD" wp14:editId="68474295">
+          <wp:inline distT="0" distB="0" distL="0" distR="0" wp14:anchorId="55BD7FA1" wp14:editId="61D632D4">
             <wp:extent cx="5652000" cy="2528526"/>
             <wp:effectExtent l="0" t="0" r="0" b="0"/>
             <wp:docPr id="16" name="Picture 16"/>
@@ -3570,7 +2568,7 @@
                     <pic:cNvPicPr/>
                   </pic:nvPicPr>
                   <pic:blipFill>
-                    <a:blip r:embed="rId13"/>
+                    <a:blip r:embed="rId15"/>
                     <a:stretch>
                       <a:fillRect/>
                     </a:stretch>
@@ -3814,7 +2812,7 @@
                 <w:rFonts w:cs="Liberation Serif"/>
                 <w:sz w:val="18"/>
               </w:rPr>
-              <w:t>Без излагања лозинки, тајни и сирових сесија.</w:t>
+              <w:t>Без излагања лозинки, тајни, приступних токена или сесијских идентификатора.</w:t>
             </w:r>
           </w:p>
         </w:tc>
@@ -3904,17 +2902,16 @@
                 <w:rFonts w:cs="Liberation Serif"/>
                 <w:sz w:val="18"/>
               </w:rPr>
-              <w:t xml:space="preserve">Одлука </w:t>
-            </w:r>
-            <w:proofErr w:type="spellStart"/>
-            <w:r>
-              <w:rPr>
-                <w:rFonts w:cs="Liberation Serif"/>
-                <w:sz w:val="18"/>
-              </w:rPr>
-              <w:t>се</w:t>
-            </w:r>
-            <w:proofErr w:type="spellEnd"/>
+              <w:t>Одлука се доноси на серверу</w:t>
+            </w:r>
+            <w:r>
+              <w:rPr>
+                <w:rFonts w:cs="Liberation Serif"/>
+                <w:sz w:val="18"/>
+                <w:lang w:val="sr-Cyrl-RS"/>
+              </w:rPr>
+              <w:t>.</w:t>
+            </w:r>
             <w:r>
               <w:rPr>
                 <w:rFonts w:cs="Liberation Serif"/>
@@ -3922,101 +2919,20 @@
               </w:rPr>
               <w:t xml:space="preserve"> </w:t>
             </w:r>
-            <w:proofErr w:type="spellStart"/>
-            <w:r>
-              <w:rPr>
-                <w:rFonts w:cs="Liberation Serif"/>
-                <w:sz w:val="18"/>
-              </w:rPr>
-              <w:t>доноси</w:t>
-            </w:r>
-            <w:proofErr w:type="spellEnd"/>
-            <w:r>
-              <w:rPr>
-                <w:rFonts w:cs="Liberation Serif"/>
-                <w:sz w:val="18"/>
-              </w:rPr>
-              <w:t xml:space="preserve"> </w:t>
-            </w:r>
-            <w:proofErr w:type="spellStart"/>
-            <w:r>
-              <w:rPr>
-                <w:rFonts w:cs="Liberation Serif"/>
-                <w:sz w:val="18"/>
-              </w:rPr>
-              <w:t>на</w:t>
-            </w:r>
-            <w:proofErr w:type="spellEnd"/>
-            <w:r>
-              <w:rPr>
-                <w:rFonts w:cs="Liberation Serif"/>
-                <w:sz w:val="18"/>
-              </w:rPr>
-              <w:t xml:space="preserve"> </w:t>
-            </w:r>
-            <w:proofErr w:type="spellStart"/>
-            <w:r>
-              <w:rPr>
-                <w:rFonts w:cs="Liberation Serif"/>
-                <w:sz w:val="18"/>
-              </w:rPr>
-              <w:t>серверу</w:t>
-            </w:r>
-            <w:proofErr w:type="spellEnd"/>
             <w:r>
               <w:rPr>
                 <w:rFonts w:cs="Liberation Serif"/>
                 <w:sz w:val="18"/>
                 <w:lang w:val="sr-Cyrl-RS"/>
               </w:rPr>
-              <w:t>.</w:t>
-            </w:r>
-            <w:r>
-              <w:rPr>
-                <w:rFonts w:cs="Liberation Serif"/>
-                <w:sz w:val="18"/>
-              </w:rPr>
-              <w:t xml:space="preserve"> </w:t>
-            </w:r>
-            <w:r>
-              <w:rPr>
-                <w:rFonts w:cs="Liberation Serif"/>
-                <w:sz w:val="18"/>
-                <w:lang w:val="sr-Cyrl-RS"/>
-              </w:rPr>
               <w:t>П</w:t>
             </w:r>
-            <w:proofErr w:type="spellStart"/>
-            <w:r>
-              <w:rPr>
-                <w:rFonts w:cs="Liberation Serif"/>
-                <w:sz w:val="18"/>
-              </w:rPr>
-              <w:t>одразумевано</w:t>
-            </w:r>
-            <w:proofErr w:type="spellEnd"/>
-            <w:r>
-              <w:rPr>
-                <w:rFonts w:cs="Liberation Serif"/>
-                <w:sz w:val="18"/>
-              </w:rPr>
-              <w:t xml:space="preserve"> </w:t>
-            </w:r>
-            <w:proofErr w:type="spellStart"/>
-            <w:r>
-              <w:rPr>
-                <w:rFonts w:cs="Liberation Serif"/>
-                <w:sz w:val="18"/>
-              </w:rPr>
-              <w:t>одбијање</w:t>
-            </w:r>
-            <w:proofErr w:type="spellEnd"/>
-            <w:r>
-              <w:rPr>
-                <w:rFonts w:cs="Liberation Serif"/>
-                <w:sz w:val="18"/>
-              </w:rPr>
-              <w:t>.</w:t>
+            <w:r>
+              <w:rPr>
+                <w:rFonts w:cs="Liberation Serif"/>
+                <w:sz w:val="18"/>
+              </w:rPr>
+              <w:t>одразумевано одбијање.</w:t>
             </w:r>
           </w:p>
         </w:tc>
@@ -4512,8 +3428,8 @@
           <w:noProof/>
         </w:rPr>
         <w:drawing>
-          <wp:inline distT="0" distB="0" distL="0" distR="0" wp14:anchorId="10D230E3" wp14:editId="6AAA3760">
-            <wp:extent cx="5652000" cy="4097700"/>
+          <wp:inline distT="0" distB="0" distL="0" distR="0" wp14:anchorId="7168EC11" wp14:editId="61354E72">
+            <wp:extent cx="5652000" cy="4085398"/>
             <wp:effectExtent l="0" t="0" r="0" b="0"/>
             <wp:docPr id="17" name="Picture 17"/>
             <wp:cNvGraphicFramePr>
@@ -4527,7 +3443,7 @@
                     <pic:cNvPicPr/>
                   </pic:nvPicPr>
                   <pic:blipFill>
-                    <a:blip r:embed="rId14"/>
+                    <a:blip r:embed="rId16"/>
                     <a:stretch>
                       <a:fillRect/>
                     </a:stretch>
@@ -4535,7 +3451,7 @@
                   <pic:spPr>
                     <a:xfrm>
                       <a:off x="0" y="0"/>
-                      <a:ext cx="5652000" cy="4097700"/>
+                      <a:ext cx="5652000" cy="4085398"/>
                     </a:xfrm>
                     <a:prstGeom prst="rect">
                       <a:avLst/>
@@ -4557,10 +3473,7 @@
         </w:rPr>
       </w:pPr>
       <w:r>
-        <w:rPr>
-          <w:rFonts w:cs="Liberation Serif"/>
-        </w:rPr>
-        <w:t>Слика 3.2.1. UML дијаграм класа: корисник, курс, лабораторија, ревизија и покушај.</w:t>
+        <w:t>Слика 3.2.1. UML дијаграм класа: идентитет, додела лабораторије, покушај и историја евалуације.</w:t>
       </w:r>
     </w:p>
     <w:p>
@@ -4574,7 +3487,7 @@
         <w:rPr>
           <w:rFonts w:cs="Liberation Serif"/>
         </w:rPr>
-        <w:t>Курс представља организациони контекст. Laboratory је трајни идентитет вежбе, а LabRevision означава конкретну објављену варијанту. Сваки Attempt је везан за једну ревизију. EvaluationResult се чува одвојено зато што може настати аутоматском или ручном провером.</w:t>
+        <w:t>Курс представља организациони контекст. Laboratory је трајни идентитет вежбе, а LabRevision означава конкретну објављену варијанту. Assignment повезује курс и објављену ревизију лабораторије са правилима доступности. Attempt се односи на једну доделу и тачну ревизију лабораторије. Један покушај може имати више записа EvaluationResult због поновне или накнадне ручне евалуације. Сваки резултат чува време, исход, начин провере и верзију евалуатора.</w:t>
       </w:r>
     </w:p>
     <w:p>
@@ -4908,7 +3821,7 @@
                 <w:rFonts w:cs="Liberation Serif"/>
                 <w:sz w:val="18"/>
               </w:rPr>
-              <w:t>Податке</w:t>
+              <w:t>Подаци</w:t>
             </w:r>
           </w:p>
         </w:tc>
@@ -5088,6 +4001,7 @@
                 <w:rFonts w:cs="Liberation Serif"/>
                 <w:sz w:val="18"/>
               </w:rPr>
+              <w:lastRenderedPageBreak/>
               <w:t>Тестови</w:t>
             </w:r>
           </w:p>
@@ -5254,9 +4168,8 @@
         <w:rPr>
           <w:noProof/>
         </w:rPr>
-        <w:lastRenderedPageBreak/>
         <w:drawing>
-          <wp:inline distT="0" distB="0" distL="0" distR="0" wp14:anchorId="1F1B3F95" wp14:editId="73630B92">
+          <wp:inline distT="0" distB="0" distL="0" distR="0" wp14:anchorId="550F586F" wp14:editId="48C07F2D">
             <wp:extent cx="5652000" cy="2528526"/>
             <wp:effectExtent l="0" t="0" r="0" b="0"/>
             <wp:docPr id="18" name="Picture 18"/>
@@ -5271,7 +4184,7 @@
                     <pic:cNvPicPr/>
                   </pic:nvPicPr>
                   <pic:blipFill>
-                    <a:blip r:embed="rId15"/>
+                    <a:blip r:embed="rId17"/>
                     <a:stretch>
                       <a:fillRect/>
                     </a:stretch>
@@ -5854,7 +4767,7 @@
                 <w:rFonts w:cs="Liberation Serif"/>
                 <w:sz w:val="18"/>
               </w:rPr>
-              <w:t>Блокиран налог не добија нове приступне сесије.</w:t>
+              <w:t>Блокирање или деактивација налога одмах опозива све активне сесије. Нове пријаве се одбијају.</w:t>
             </w:r>
           </w:p>
         </w:tc>
@@ -6298,7 +5211,7 @@
                 <w:rFonts w:cs="Liberation Serif"/>
                 <w:sz w:val="18"/>
               </w:rPr>
-              <w:t>Историја активних сесија и опозив</w:t>
+              <w:t>Кориснички преглед сесија и селективни опозив</w:t>
             </w:r>
           </w:p>
         </w:tc>
@@ -6326,7 +5239,7 @@
                 <w:rFonts w:cs="Liberation Serif"/>
                 <w:sz w:val="18"/>
               </w:rPr>
-              <w:t>Опозвана сесија не може да настави захтеве.</w:t>
+              <w:t>Корисник може да прегледа и појединачно опозове своје сесије. Сваки захтев са опозваном сесијом се одбија.</w:t>
             </w:r>
           </w:p>
         </w:tc>
@@ -7593,7 +6506,6 @@
         <w:rPr>
           <w:rFonts w:ascii="Liberation Serif" w:hAnsi="Liberation Serif" w:cs="Liberation Serif"/>
         </w:rPr>
-        <w:lastRenderedPageBreak/>
         <w:t>4.3 Каталог лабораторија и тематске области</w:t>
       </w:r>
       <w:bookmarkEnd w:id="12"/>
@@ -9547,7 +8459,7 @@
                 <w:rFonts w:cs="Liberation Serif"/>
                 <w:sz w:val="18"/>
               </w:rPr>
-              <w:t>Преглед ученичког приказа пре објаве</w:t>
+              <w:t>Преглед студентског приказа пре објаве</w:t>
             </w:r>
           </w:p>
         </w:tc>
@@ -9720,6 +8632,22 @@
         <w:rPr>
           <w:rFonts w:ascii="Liberation Serif" w:hAnsi="Liberation Serif" w:cs="Liberation Serif"/>
         </w:rPr>
+        <w:br w:type="page"/>
+      </w:r>
+    </w:p>
+    <w:p>
+      <w:pPr>
+        <w:pStyle w:val="Heading2"/>
+        <w:spacing w:before="150" w:after="96"/>
+        <w:rPr>
+          <w:rFonts w:ascii="Liberation Serif" w:hAnsi="Liberation Serif" w:cs="Liberation Serif"/>
+        </w:rPr>
+      </w:pPr>
+      <w:r>
+        <w:rPr>
+          <w:rFonts w:ascii="Liberation Serif" w:hAnsi="Liberation Serif" w:cs="Liberation Serif"/>
+        </w:rPr>
+        <w:lastRenderedPageBreak/>
         <w:t>4.5 Објављивање, верзије и повлачење</w:t>
       </w:r>
       <w:bookmarkEnd w:id="14"/>
@@ -9753,11 +8681,10 @@
         <w:rPr>
           <w:noProof/>
         </w:rPr>
-        <w:lastRenderedPageBreak/>
         <w:drawing>
-          <wp:inline distT="0" distB="0" distL="0" distR="0" wp14:anchorId="39BFD514" wp14:editId="0F5E2F78">
-            <wp:extent cx="5652000" cy="2260800"/>
-            <wp:effectExtent l="0" t="0" r="0" b="0"/>
+          <wp:inline distT="0" distB="0" distL="0" distR="0" wp14:anchorId="1BDBCDEC" wp14:editId="33C40581">
+            <wp:extent cx="5651500" cy="1698537"/>
+            <wp:effectExtent l="0" t="0" r="0" b="3810"/>
             <wp:docPr id="19" name="Picture 19"/>
             <wp:cNvGraphicFramePr>
               <a:graphicFrameLocks xmlns:a="http://schemas.openxmlformats.org/drawingml/2006/main" noChangeAspect="1"/>
@@ -9769,20 +8696,29 @@
                     <pic:cNvPr id="0" name="05_revision_state.png"/>
                     <pic:cNvPicPr/>
                   </pic:nvPicPr>
-                  <pic:blipFill>
-                    <a:blip r:embed="rId16"/>
+                  <pic:blipFill rotWithShape="1">
+                    <a:blip r:embed="rId18"/>
+                    <a:srcRect t="24863"/>
                     <a:stretch>
                       <a:fillRect/>
                     </a:stretch>
                   </pic:blipFill>
-                  <pic:spPr>
+                  <pic:spPr bwMode="auto">
                     <a:xfrm>
                       <a:off x="0" y="0"/>
-                      <a:ext cx="5652000" cy="2260800"/>
+                      <a:ext cx="5652000" cy="1698687"/>
                     </a:xfrm>
                     <a:prstGeom prst="rect">
                       <a:avLst/>
                     </a:prstGeom>
+                    <a:ln>
+                      <a:noFill/>
+                    </a:ln>
+                    <a:extLst>
+                      <a:ext uri="{53640926-AAD7-44D8-BBD7-CCE9431645EC}">
+                        <a14:shadowObscured xmlns:a14="http://schemas.microsoft.com/office/drawing/2010/main"/>
+                      </a:ext>
+                    </a:extLst>
                   </pic:spPr>
                 </pic:pic>
               </a:graphicData>
@@ -10646,7 +9582,7 @@
                 <w:rFonts w:cs="Liberation Serif"/>
                 <w:sz w:val="18"/>
               </w:rPr>
-              <w:t>Видљив је delta према претходној верзији.</w:t>
+              <w:t>Приказане су разлике у односу на претходну верзију.</w:t>
             </w:r>
           </w:p>
         </w:tc>
@@ -11812,7 +10748,7 @@
         <w:rPr>
           <w:rFonts w:cs="Liberation Serif"/>
         </w:rPr>
-        <w:t>Покретање, чување, наставак и предаја студентског рада.</w:t>
+        <w:t>Покретање, чување, наставак и предаја студентског рада. Животни циклус покушаја одређује ATT-06. Статус покушаја није исто што и исход евалуације из EVAL-04.</w:t>
       </w:r>
     </w:p>
     <w:p>
@@ -11830,8 +10766,8 @@
           <w:noProof/>
         </w:rPr>
         <w:drawing>
-          <wp:inline distT="0" distB="0" distL="0" distR="0" wp14:anchorId="2B4FC1D9" wp14:editId="2DCC5E9A">
-            <wp:extent cx="5652000" cy="2630139"/>
+          <wp:inline distT="0" distB="0" distL="0" distR="0" wp14:anchorId="38205E3A" wp14:editId="4CCBB63B">
+            <wp:extent cx="5652000" cy="2569337"/>
             <wp:effectExtent l="0" t="0" r="0" b="0"/>
             <wp:docPr id="30" name="Picture 30"/>
             <wp:cNvGraphicFramePr>
@@ -11845,7 +10781,7 @@
                     <pic:cNvPicPr/>
                   </pic:nvPicPr>
                   <pic:blipFill>
-                    <a:blip r:embed="rId17"/>
+                    <a:blip r:embed="rId19"/>
                     <a:stretch>
                       <a:fillRect/>
                     </a:stretch>
@@ -11853,7 +10789,7 @@
                   <pic:spPr>
                     <a:xfrm>
                       <a:off x="0" y="0"/>
-                      <a:ext cx="5652000" cy="2630139"/>
+                      <a:ext cx="5652000" cy="2569337"/>
                     </a:xfrm>
                     <a:prstGeom prst="rect">
                       <a:avLst/>
@@ -11875,10 +10811,7 @@
         </w:rPr>
       </w:pPr>
       <w:r>
-        <w:rPr>
-          <w:rFonts w:cs="Liberation Serif"/>
-        </w:rPr>
-        <w:t>Слика 4.7.1. UML дијаграм стања: животни циклус студентског покушаја.</w:t>
+        <w:t>Слика 4.7.1. UML дијаграм стања: дозвољени прелази студентског покушаја.</w:t>
       </w:r>
     </w:p>
     <w:tbl>
@@ -12693,7 +11626,7 @@
                 <w:rFonts w:cs="Liberation Serif"/>
                 <w:sz w:val="18"/>
               </w:rPr>
-              <w:t>Стања започет, у току, предат, завршен</w:t>
+              <w:t>Стања: започет, у току, предат, у евалуацији, чека ручни преглед, завршен, истекао, отказан</w:t>
             </w:r>
           </w:p>
         </w:tc>
@@ -12721,7 +11654,7 @@
                 <w:rFonts w:cs="Liberation Serif"/>
                 <w:sz w:val="18"/>
               </w:rPr>
-              <w:t>Недозвољен прелаз статуса се одбија.</w:t>
+              <w:t>Прихватају се само прелази приказани на дијаграму 4.7.1. Отказивање је дозвољено пре предаје, а истек само ако је укључено временско ограничење.</w:t>
             </w:r>
           </w:p>
         </w:tc>
@@ -12839,7 +11772,7 @@
                 <w:rFonts w:cs="Liberation Serif"/>
                 <w:sz w:val="18"/>
               </w:rPr>
-              <w:t>Истек је серверски ауторитативан и не зависи од локалног сата.</w:t>
+              <w:t>Ако је временско ограничење омогућено, сервер одређује истек. Истекли покушај не прихвата нове одговоре.</w:t>
             </w:r>
           </w:p>
         </w:tc>
@@ -12929,7 +11862,7 @@
                 <w:rFonts w:cs="Liberation Serif"/>
                 <w:sz w:val="18"/>
               </w:rPr>
-              <w:t>Евиденција дозволених акција унутар покушаја</w:t>
+              <w:t>Евиденција дозвољених акција унутар покушаја</w:t>
             </w:r>
           </w:p>
         </w:tc>
@@ -12984,6 +11917,22 @@
         <w:rPr>
           <w:rFonts w:ascii="Liberation Serif" w:hAnsi="Liberation Serif" w:cs="Liberation Serif"/>
         </w:rPr>
+        <w:br w:type="page"/>
+      </w:r>
+    </w:p>
+    <w:p>
+      <w:pPr>
+        <w:pStyle w:val="Heading2"/>
+        <w:spacing w:before="150" w:after="96"/>
+        <w:rPr>
+          <w:rFonts w:ascii="Liberation Serif" w:hAnsi="Liberation Serif" w:cs="Liberation Serif"/>
+        </w:rPr>
+      </w:pPr>
+      <w:r>
+        <w:rPr>
+          <w:rFonts w:ascii="Liberation Serif" w:hAnsi="Liberation Serif" w:cs="Liberation Serif"/>
+        </w:rPr>
+        <w:lastRenderedPageBreak/>
         <w:t>4.8 Језгро евалуације и резултати</w:t>
       </w:r>
       <w:bookmarkEnd w:id="17"/>
@@ -13017,9 +11966,8 @@
         <w:rPr>
           <w:noProof/>
         </w:rPr>
-        <w:lastRenderedPageBreak/>
         <w:drawing>
-          <wp:inline distT="0" distB="0" distL="0" distR="0" wp14:anchorId="1455F956" wp14:editId="414B2558">
+          <wp:inline distT="0" distB="0" distL="0" distR="0" wp14:anchorId="3E1AC322" wp14:editId="23BCD70E">
             <wp:extent cx="5652000" cy="2345580"/>
             <wp:effectExtent l="0" t="0" r="0" b="0"/>
             <wp:docPr id="21" name="Picture 21"/>
@@ -13034,7 +11982,7 @@
                     <pic:cNvPicPr/>
                   </pic:nvPicPr>
                   <pic:blipFill>
-                    <a:blip r:embed="rId18"/>
+                    <a:blip r:embed="rId20"/>
                     <a:stretch>
                       <a:fillRect/>
                     </a:stretch>
@@ -13646,7 +12594,7 @@
                 <w:rFonts w:cs="Liberation Serif"/>
                 <w:sz w:val="18"/>
               </w:rPr>
-              <w:t>Исход: успешно, неуспешно, делимично, ручно</w:t>
+              <w:t>Раздвојени исход, статус и начин евалуације</w:t>
             </w:r>
           </w:p>
         </w:tc>
@@ -13674,7 +12622,7 @@
                 <w:rFonts w:cs="Liberation Serif"/>
                 <w:sz w:val="18"/>
               </w:rPr>
-              <w:t>Вредности су ограничене дефинисаним скупом.</w:t>
+              <w:t>Исход: успешан, неуспешан, делимичан. Статус: на чекању, у току, ручни преглед, завршен, техничка грешка. Начин: аутоматски или ручни.</w:t>
             </w:r>
           </w:p>
         </w:tc>
@@ -13764,7 +12712,7 @@
                 <w:rFonts w:cs="Liberation Serif"/>
                 <w:sz w:val="18"/>
               </w:rPr>
-              <w:t>Резултат је везан за ID покушаја и evaluator верзију</w:t>
+              <w:t>Историја резултата за покушај и верзију евалуатора</w:t>
             </w:r>
           </w:p>
         </w:tc>
@@ -13792,7 +12740,7 @@
                 <w:rFonts w:cs="Liberation Serif"/>
                 <w:sz w:val="18"/>
               </w:rPr>
-              <w:t>Поновљена евалуација је ревизибилна и не брише претходни запис.</w:t>
+              <w:t>За сваку поновну евалуацију чувају се резултат, време и верзија евалуатора, без брисања претходних записа.</w:t>
             </w:r>
           </w:p>
         </w:tc>
@@ -13910,7 +12858,7 @@
                 <w:rFonts w:cs="Liberation Serif"/>
                 <w:sz w:val="18"/>
               </w:rPr>
-              <w:t>Технички неуспех се бележи засебним статусом.</w:t>
+              <w:t>Грешка евалуатора се означава техничким статусом. Не уписује се негативан исход студентског рада.</w:t>
             </w:r>
           </w:p>
         </w:tc>
@@ -14159,6 +13107,15 @@
           <w:rFonts w:cs="Liberation Serif"/>
         </w:rPr>
       </w:pPr>
+    </w:p>
+    <w:p>
+      <w:pPr>
+        <w:keepLines/>
+        <w:spacing w:after="140"/>
+      </w:pPr>
+      <w:r>
+        <w:t>Подаци о евалуацији су раздвојени: исход описује исправност решења, статус обраде описује ток провере, а начин евалуације разликује аутоматску и ручну проверу. Поновна евалуација додаје нови резултат у историју без преписивања претходног. Технички неуспех не мења оцену студентског одговора.</w:t>
+      </w:r>
     </w:p>
     <w:p>
       <w:pPr>
@@ -14476,6 +13433,7 @@
                 <w:rFonts w:cs="Liberation Serif"/>
                 <w:sz w:val="18"/>
               </w:rPr>
+              <w:lastRenderedPageBreak/>
               <w:t>REVW-02</w:t>
             </w:r>
           </w:p>
@@ -14796,7 +13754,7 @@
                 <w:rFonts w:cs="Liberation Serif"/>
                 <w:sz w:val="18"/>
               </w:rPr>
-              <w:t>Ученички API не открива интерне референтне податке.</w:t>
+              <w:t>Студентски API не открива интерне референтне податке.</w:t>
             </w:r>
           </w:p>
         </w:tc>
@@ -15066,7 +14024,6 @@
                 <w:rFonts w:cs="Liberation Serif"/>
                 <w:sz w:val="18"/>
               </w:rPr>
-              <w:lastRenderedPageBreak/>
               <w:t>REVW-07</w:t>
             </w:r>
           </w:p>
@@ -16957,6 +15914,7 @@
                 <w:rFonts w:cs="Liberation Serif"/>
                 <w:sz w:val="18"/>
               </w:rPr>
+              <w:lastRenderedPageBreak/>
               <w:t>AUD-06</w:t>
             </w:r>
           </w:p>
@@ -17489,7 +16447,6 @@
                 <w:rFonts w:cs="Liberation Serif"/>
                 <w:sz w:val="18"/>
               </w:rPr>
-              <w:lastRenderedPageBreak/>
               <w:t>ADM-02</w:t>
             </w:r>
           </w:p>
@@ -18164,7 +17121,7 @@
                 <w:rFonts w:cs="Liberation Serif"/>
                 <w:sz w:val="18"/>
               </w:rPr>
-              <w:t>Захтев не нарушава легитимни ревизорски интегритет.</w:t>
+              <w:t>Захтев чува непроменљивост и проверљивост постојећих ревизорских записа.</w:t>
             </w:r>
           </w:p>
         </w:tc>
@@ -19431,6 +18388,7 @@
         <w:rPr>
           <w:rFonts w:ascii="Liberation Serif" w:hAnsi="Liberation Serif" w:cs="Liberation Serif"/>
         </w:rPr>
+        <w:lastRenderedPageBreak/>
         <w:t>4.14 Изоловано извршавање и техничке лабораторије</w:t>
       </w:r>
       <w:bookmarkEnd w:id="23"/>
@@ -19464,9 +18422,8 @@
         <w:rPr>
           <w:noProof/>
         </w:rPr>
-        <w:lastRenderedPageBreak/>
         <w:drawing>
-          <wp:inline distT="0" distB="0" distL="0" distR="0" wp14:anchorId="7AE47748" wp14:editId="29C10EF3">
+          <wp:inline distT="0" distB="0" distL="0" distR="0" wp14:anchorId="1E92F68D" wp14:editId="0709371F">
             <wp:extent cx="5652000" cy="2647516"/>
             <wp:effectExtent l="0" t="0" r="0" b="0"/>
             <wp:docPr id="22" name="Picture 22"/>
@@ -19481,7 +18438,7 @@
                     <pic:cNvPicPr/>
                   </pic:nvPicPr>
                   <pic:blipFill>
-                    <a:blip r:embed="rId19"/>
+                    <a:blip r:embed="rId21"/>
                     <a:stretch>
                       <a:fillRect/>
                     </a:stretch>
@@ -20475,7 +19432,7 @@
                 <w:rFonts w:cs="Liberation Serif"/>
                 <w:sz w:val="18"/>
               </w:rPr>
-              <w:t>Резултат се повезује са тачно једним покушајем.</w:t>
+              <w:t>Потпис покрива ID покушаја, ревизију, исход и време извршавања. Платформа проверава потпис поузданим кључем и одбија измењен, непотписан или поново употребљен резултат.</w:t>
             </w:r>
           </w:p>
         </w:tc>
@@ -20520,7 +19477,7 @@
         <w:rPr>
           <w:rFonts w:cs="Liberation Serif"/>
         </w:rPr>
-        <w:t>Отворене границе за будуће интерфејсе и институционалне системе.</w:t>
+        <w:t>Отворене границе за будуће интерфејсе и институционалне системе. Контрактне тестове за INT-06 одржава платформа као верзионисан пакет провера. Додатак мора да прође тај пакет пре регистрације, без права да мења објављене ревизије или туђе покушаје.</w:t>
       </w:r>
     </w:p>
     <w:tbl>
@@ -21363,7 +20320,7 @@
                 <w:rFonts w:cs="Liberation Serif"/>
                 <w:sz w:val="18"/>
               </w:rPr>
-              <w:t>Нови тип испуњава верзионисани уговор и пролази сертификационе тестове.</w:t>
+              <w:t>Нови тип мора да прође верзионисане контрактне тестове за шему улаза и излаза, негативни приступ, обраду грешака и компатибилност уговора.</w:t>
             </w:r>
           </w:p>
         </w:tc>
@@ -21695,7 +20652,7 @@
         </w:rPr>
       </w:pPr>
       <w:r>
-        <w:t>Провера: Поређење стања пре и после измене показује да ли су нарушена правила исправљена.</w:t>
+        <w:t>Провера: Поређење стања пре и после измене показује да ли су отклоњена одступања од задатих правила.</w:t>
       </w:r>
     </w:p>
     <w:p>
@@ -21779,6 +20736,7 @@
           <w:i/>
           <w:sz w:val="19"/>
         </w:rPr>
+        <w:lastRenderedPageBreak/>
         <w:t>Повезани захтеви: TYP-04, AUT-02, REVW-02</w:t>
       </w:r>
     </w:p>
@@ -21794,7 +20752,6 @@
         <w:rPr>
           <w:rFonts w:ascii="Liberation Serif" w:hAnsi="Liberation Serif" w:cs="Liberation Serif"/>
         </w:rPr>
-        <w:lastRenderedPageBreak/>
         <w:t>5.5 MFA и управљање сесијама</w:t>
       </w:r>
       <w:bookmarkEnd w:id="30"/>
@@ -22159,7 +21116,7 @@
         <w:rPr>
           <w:rFonts w:cs="Liberation Serif"/>
         </w:rPr>
-        <w:t>Основни ток: Сачува се одговор, покушај пређе у Предат и покрене се одговарајући evaluator.</w:t>
+        <w:t>Основни ток: Сачува се одговор, покушај прелази у „Предат“, а затим у „У евалуацији“. Аутоматска провера га завршава или усмерава на ручни преглед. Историја резултата остаје сачувана.</w:t>
       </w:r>
     </w:p>
     <w:p>
@@ -22192,7 +21149,7 @@
           <w:noProof/>
         </w:rPr>
         <w:drawing>
-          <wp:inline distT="0" distB="0" distL="0" distR="0" wp14:anchorId="6E675B9D" wp14:editId="0E327FFD">
+          <wp:inline distT="0" distB="0" distL="0" distR="0" wp14:anchorId="07946713" wp14:editId="6342E9F7">
             <wp:extent cx="4860000" cy="3997989"/>
             <wp:effectExtent l="0" t="0" r="0" b="0"/>
             <wp:docPr id="28" name="Picture 28"/>
@@ -22207,7 +21164,7 @@
                     <pic:cNvPicPr/>
                   </pic:nvPicPr>
                   <pic:blipFill>
-                    <a:blip r:embed="rId20"/>
+                    <a:blip r:embed="rId22"/>
                     <a:stretch>
                       <a:fillRect/>
                     </a:stretch>
@@ -22302,7 +21259,8 @@
         <w:rPr>
           <w:rFonts w:cs="Liberation Serif"/>
         </w:rPr>
-        <w:t>Алтернативни и негативни ток: Непотпуна шема или недозвољен аутор не могу да објаве лабораторију.</w:t>
+        <w:lastRenderedPageBreak/>
+        <w:t>Алтернативни и негативни ток: Систем одбија објављивање ако је шема непотпуна или аутор нема овлашћење.</w:t>
       </w:r>
     </w:p>
     <w:p>
@@ -22319,9 +21277,8 @@
         <w:rPr>
           <w:noProof/>
         </w:rPr>
-        <w:lastRenderedPageBreak/>
         <w:drawing>
-          <wp:inline distT="0" distB="0" distL="0" distR="0" wp14:anchorId="4264BA3E" wp14:editId="2D49B23E">
+          <wp:inline distT="0" distB="0" distL="0" distR="0" wp14:anchorId="19168D10" wp14:editId="112E5A9C">
             <wp:extent cx="5076000" cy="2270842"/>
             <wp:effectExtent l="0" t="0" r="0" b="0"/>
             <wp:docPr id="29" name="Picture 29"/>
@@ -22336,7 +21293,7 @@
                     <pic:cNvPicPr/>
                   </pic:nvPicPr>
                   <pic:blipFill>
-                    <a:blip r:embed="rId21"/>
+                    <a:blip r:embed="rId23"/>
                     <a:stretch>
                       <a:fillRect/>
                     </a:stretch>
@@ -22478,7 +21435,7 @@
         <w:rPr>
           <w:rFonts w:cs="Liberation Serif"/>
         </w:rPr>
-        <w:t>Основни ток: Администратор мења статус налога. Систем опозива активне сесије и евидентира радњу.</w:t>
+        <w:t>Основни ток: Администратор блокира или деактивира налог. Систем одмах опозива све активне сесије, одбија даље захтеве са тим сесијама и бележи радњу. Ово је обавезно понашање независно од додатног корисничког прегледа сесија (IDN-07).</w:t>
       </w:r>
     </w:p>
     <w:p>
@@ -22540,7 +21497,7 @@
         <w:rPr>
           <w:rFonts w:cs="Liberation Serif"/>
         </w:rPr>
-        <w:t>Основни ток: Чита immutable snapshot, резултат чува одвојено, враћа дозвољени feedback.</w:t>
+        <w:t>Основни ток: Чита непроменљив снимак података, чува резултат одвојено и враћа дозвољену повратну информацију.</w:t>
       </w:r>
     </w:p>
     <w:p>
@@ -22555,7 +21512,7 @@
         <w:rPr>
           <w:rFonts w:cs="Liberation Serif"/>
         </w:rPr>
-        <w:t>Алтернативни и негативни ток: Техничка грешка евалуатора не сме се третирати као нетачан студентски одговор. Прекорачење временског ограничења бележи се као засебан исход.</w:t>
+        <w:t>Алтернативни и негативни ток: Техничка грешка евалуатора и прекорачење временског ограничења евалуације бележе се као технички статуси, не као погрешан студентски одговор. Систем омогућава контролисано поновно покретање или ручни преглед.</w:t>
       </w:r>
     </w:p>
     <w:p>
@@ -23024,7 +21981,7 @@
                 <w:rFonts w:cs="Liberation Serif"/>
                 <w:sz w:val="18"/>
               </w:rPr>
-              <w:t>Опозвана сесија више није употребљива. Покушај CSRF злоупотребе мора бити одбијен.</w:t>
+              <w:t>Сваки захтев са опозваном сесијом се одбија. Покушај CSRF злоупотребе такође мора бити одбијен.</w:t>
             </w:r>
           </w:p>
         </w:tc>
@@ -24524,7 +23481,7 @@
           <w:noProof/>
         </w:rPr>
         <w:drawing>
-          <wp:inline distT="0" distB="0" distL="0" distR="0" wp14:anchorId="7F47C691" wp14:editId="7F99A4E7">
+          <wp:inline distT="0" distB="0" distL="0" distR="0" wp14:anchorId="3A56C433" wp14:editId="2DB1B4D7">
             <wp:extent cx="5652000" cy="2350042"/>
             <wp:effectExtent l="0" t="0" r="0" b="0"/>
             <wp:docPr id="25" name="Picture 25"/>
@@ -24539,7 +23496,7 @@
                     <pic:cNvPicPr/>
                   </pic:nvPicPr>
                   <pic:blipFill>
-                    <a:blip r:embed="rId22"/>
+                    <a:blip r:embed="rId24"/>
                     <a:stretch>
                       <a:fillRect/>
                     </a:stretch>
@@ -24603,7 +23560,7 @@
           <w:noProof/>
         </w:rPr>
         <w:drawing>
-          <wp:inline distT="0" distB="0" distL="0" distR="0" wp14:anchorId="44583844" wp14:editId="07735668">
+          <wp:inline distT="0" distB="0" distL="0" distR="0" wp14:anchorId="15736D8E" wp14:editId="083EA513">
             <wp:extent cx="5652000" cy="2617768"/>
             <wp:effectExtent l="0" t="0" r="0" b="0"/>
             <wp:docPr id="26" name="Picture 26"/>
@@ -24618,7 +23575,7 @@
                     <pic:cNvPicPr/>
                   </pic:nvPicPr>
                   <pic:blipFill>
-                    <a:blip r:embed="rId23"/>
+                    <a:blip r:embed="rId25"/>
                     <a:stretch>
                       <a:fillRect/>
                     </a:stretch>
@@ -25194,21 +24151,35 @@
         </w:rPr>
         <w:t>•  Проверљив поступак покретања са тестним подацима, без стварних студентских налога и тајни.</w:t>
       </w:r>
+      <w:bookmarkStart w:id="48" w:name="oiblab_h_64"/>
     </w:p>
     <w:p>
       <w:pPr>
-        <w:pStyle w:val="Heading1"/>
-        <w:pageBreakBefore/>
-        <w:rPr>
-          <w:rFonts w:ascii="Liberation Serif" w:hAnsi="Liberation Serif" w:cs="Liberation Serif"/>
+        <w:pStyle w:val="OIBBullet"/>
+        <w:rPr>
+          <w:rFonts w:cs="Liberation Serif"/>
         </w:rPr>
       </w:pPr>
-      <w:bookmarkStart w:id="48" w:name="oiblab_h_64"/>
+    </w:p>
+    <w:p>
+      <w:pPr>
+        <w:pStyle w:val="OIBBullet"/>
+        <w:rPr>
+          <w:rFonts w:cs="Liberation Serif"/>
+          <w:b/>
+          <w:bCs/>
+          <w:sz w:val="34"/>
+          <w:szCs w:val="34"/>
+        </w:rPr>
+      </w:pPr>
       <w:r>
         <w:rPr>
-          <w:rFonts w:ascii="Liberation Serif" w:hAnsi="Liberation Serif" w:cs="Liberation Serif"/>
-        </w:rPr>
-        <w:lastRenderedPageBreak/>
+          <w:rFonts w:cs="Liberation Serif"/>
+          <w:b/>
+          <w:bCs/>
+          <w:sz w:val="34"/>
+          <w:szCs w:val="34"/>
+        </w:rPr>
         <w:t>9 Речник појмова</w:t>
       </w:r>
       <w:bookmarkEnd w:id="48"/>
@@ -25595,7 +24566,7 @@
                 <w:rFonts w:cs="Liberation Serif"/>
                 <w:sz w:val="18"/>
               </w:rPr>
-              <w:t>Додела ревизије курса, групи или студенту са роковима и правилима.</w:t>
+              <w:t>Додела ревизије лабораторије курсу, групи или студенту са роковима и правилима.</w:t>
             </w:r>
           </w:p>
         </w:tc>
@@ -25872,11 +24843,10 @@
       </w:r>
     </w:p>
     <w:sectPr>
-      <w:headerReference w:type="default" r:id="rId24"/>
-      <w:footerReference w:type="default" r:id="rId25"/>
+      <w:headerReference w:type="default" r:id="rId26"/>
+      <w:footerReference w:type="default" r:id="rId27"/>
       <w:pgSz w:w="11906" w:h="16838"/>
-      <w:pgMar w:top="1389" w:right="1389" w:bottom="1219" w:left="1446" w:header="652" w:footer="680" w:gutter="0"/>
-      <w:pgNumType w:start="1"/>
+      <w:pgMar w:top="1389" w:right="1389" w:bottom="1219" w:left="1446" w:header="737" w:footer="737" w:gutter="0"/>
       <w:cols w:space="720"/>
       <w:docGrid w:linePitch="360"/>
     </w:sectPr>
@@ -25925,35 +24895,100 @@
     <w:pPr>
       <w:pStyle w:val="Footer"/>
       <w:pBdr>
-        <w:bottom w:val="single" w:sz="6" w:space="1" w:color="auto"/>
+        <w:top w:val="single" w:sz="6" w:space="7" w:color="595959"/>
       </w:pBdr>
+      <w:spacing w:before="100"/>
       <w:jc w:val="right"/>
       <w:rPr>
         <w:sz w:val="18"/>
       </w:rPr>
     </w:pPr>
+    <w:r>
+      <w:rPr>
+        <w:color w:val="232323"/>
+        <w:sz w:val="18"/>
+      </w:rPr>
+      <w:fldChar w:fldCharType="begin"/>
+    </w:r>
+    <w:r>
+      <w:rPr>
+        <w:color w:val="232323"/>
+        <w:sz w:val="18"/>
+      </w:rPr>
+      <w:instrText xml:space="preserve"> PAGE </w:instrText>
+    </w:r>
+    <w:r>
+      <w:rPr>
+        <w:color w:val="232323"/>
+        <w:sz w:val="18"/>
+      </w:rPr>
+      <w:fldChar w:fldCharType="separate"/>
+    </w:r>
+    <w:r>
+      <w:rPr>
+        <w:color w:val="232323"/>
+        <w:sz w:val="18"/>
+      </w:rPr>
+      <w:t>1</w:t>
+    </w:r>
+    <w:r>
+      <w:rPr>
+        <w:color w:val="232323"/>
+        <w:sz w:val="18"/>
+      </w:rPr>
+      <w:fldChar w:fldCharType="end"/>
+    </w:r>
   </w:p>
+</w:ftr>
+</file>
+
+<file path=word/footer3.xml><?xml version="1.0" encoding="utf-8"?>
+<w:ftr xmlns:wpc="http://schemas.microsoft.com/office/word/2010/wordprocessingCanvas" xmlns:cx="http://schemas.microsoft.com/office/drawing/2014/chartex" xmlns:cx1="http://schemas.microsoft.com/office/drawing/2015/9/8/chartex" xmlns:cx2="http://schemas.microsoft.com/office/drawing/2015/10/21/chartex" xmlns:cx3="http://schemas.microsoft.com/office/drawing/2016/5/9/chartex" xmlns:cx4="http://schemas.microsoft.com/office/drawing/2016/5/10/chartex" xmlns:cx5="http://schemas.microsoft.com/office/drawing/2016/5/11/chartex" xmlns:cx6="http://schemas.microsoft.com/office/drawing/2016/5/12/chartex" xmlns:cx7="http://schemas.microsoft.com/office/drawing/2016/5/13/chartex" xmlns:cx8="http://schemas.microsoft.com/office/drawing/2016/5/14/chartex" xmlns:mc="http://schemas.openxmlformats.org/markup-compatibility/2006" xmlns:m="http://schemas.openxmlformats.org/officeDocument/2006/math" xmlns:aink="http://schemas.microsoft.com/office/drawing/2016/ink" xmlns:am3d="http://schemas.microsoft.com/office/drawing/2017/model3d" xmlns:oel="http://schemas.microsoft.com/office/2019/extlst" xmlns:r="http://schemas.openxmlformats.org/officeDocument/2006/relationships" xmlns:wp14="http://schemas.microsoft.com/office/word/2010/wordprocessingDrawing" xmlns:wp="http://schemas.openxmlformats.org/drawingml/2006/wordprocessingDrawing" xmlns:wpg="http://schemas.microsoft.com/office/word/2010/wordprocessingGroup" xmlns:wpi="http://schemas.microsoft.com/office/word/2010/wordprocessingInk" xmlns:wps="http://schemas.microsoft.com/office/word/2010/wordprocessingShape" xmlns:o="urn:schemas-microsoft-com:office:office" xmlns:v="urn:schemas-microsoft-com:vml" xmlns:w10="urn:schemas-microsoft-com:office:word" xmlns:w="http://schemas.openxmlformats.org/wordprocessingml/2006/main" xmlns:w14="http://schemas.microsoft.com/office/word/2010/wordml" xmlns:w15="http://schemas.microsoft.com/office/word/2012/wordml" xmlns:w16cex="http://schemas.microsoft.com/office/word/2018/wordml/cex" xmlns:w16cid="http://schemas.microsoft.com/office/word/2016/wordml/cid" xmlns:w16="http://schemas.microsoft.com/office/word/2018/wordml" xmlns:w16sdtdh="http://schemas.microsoft.com/office/word/2020/wordml/sdtdatahash" xmlns:w16sdtfl="http://schemas.microsoft.com/office/word/2024/wordml/sdtformatlock" xmlns:w16se="http://schemas.microsoft.com/office/word/2015/wordml/symex" xmlns:w16du="http://schemas.microsoft.com/office/word/2023/wordml/word16du" xmlns:wne="http://schemas.microsoft.com/office/word/2006/wordml" mc:Ignorable="w14 w15 w16se w16cid w16 w16cex w16sdtdh w16sdtfl w16du wp14">
   <w:p>
     <w:pPr>
       <w:pStyle w:val="Footer"/>
+      <w:pBdr>
+        <w:top w:val="single" w:sz="6" w:space="7" w:color="595959"/>
+      </w:pBdr>
+      <w:spacing w:before="100"/>
       <w:jc w:val="right"/>
+      <w:rPr>
+        <w:sz w:val="18"/>
+      </w:rPr>
     </w:pPr>
     <w:r>
+      <w:rPr>
+        <w:color w:val="232323"/>
+        <w:sz w:val="18"/>
+      </w:rPr>
       <w:fldChar w:fldCharType="begin"/>
     </w:r>
     <w:r>
+      <w:rPr>
+        <w:color w:val="232323"/>
+        <w:sz w:val="18"/>
+      </w:rPr>
       <w:instrText xml:space="preserve"> PAGE </w:instrText>
     </w:r>
     <w:r>
+      <w:rPr>
+        <w:color w:val="232323"/>
+        <w:sz w:val="18"/>
+      </w:rPr>
       <w:fldChar w:fldCharType="separate"/>
     </w:r>
     <w:r>
       <w:rPr>
-        <w:noProof/>
+        <w:color w:val="232323"/>
+        <w:sz w:val="18"/>
       </w:rPr>
       <w:t>1</w:t>
     </w:r>
     <w:r>
+      <w:rPr>
+        <w:color w:val="232323"/>
+        <w:sz w:val="18"/>
+      </w:rPr>
       <w:fldChar w:fldCharType="end"/>
     </w:r>
   </w:p>
@@ -26001,38 +25036,80 @@
     <w:pPr>
       <w:pStyle w:val="Header"/>
       <w:pBdr>
-        <w:bottom w:val="single" w:sz="6" w:space="1" w:color="auto"/>
+        <w:bottom w:val="single" w:sz="6" w:space="6" w:color="595959"/>
       </w:pBdr>
       <w:tabs>
         <w:tab w:val="right" w:pos="9071"/>
       </w:tabs>
+      <w:spacing w:after="120"/>
       <w:rPr>
         <w:sz w:val="16"/>
+        <w:lang w:val="sr-Cyrl-RS"/>
       </w:rPr>
     </w:pPr>
     <w:r>
       <w:rPr>
-        <w:sz w:val="16"/>
+        <w:color w:val="323232"/>
+        <w:sz w:val="18"/>
       </w:rPr>
       <w:t>ОСНОВЕ ИНФОРМАЦИОНЕ БЕЗБЕДНОСТИ</w:t>
     </w:r>
     <w:r>
       <w:rPr>
-        <w:sz w:val="16"/>
-      </w:rPr>
-      <w:tab/>
+        <w:color w:val="323232"/>
+        <w:sz w:val="18"/>
+      </w:rPr>
+      <w:t xml:space="preserve">                                                       </w:t>
     </w:r>
     <w:r>
       <w:rPr>
-        <w:sz w:val="16"/>
-      </w:rPr>
-      <w:t xml:space="preserve">                                                                                      </w:t>
+        <w:color w:val="323232"/>
+        <w:sz w:val="18"/>
+        <w:lang w:val="sr-Cyrl-RS"/>
+      </w:rPr>
+      <w:t xml:space="preserve"> </w:t>
     </w:r>
     <w:r>
       <w:rPr>
+        <w:color w:val="323232"/>
+        <w:sz w:val="18"/>
+      </w:rPr>
+      <w:t xml:space="preserve">     </w:t>
+    </w:r>
+  </w:p>
+  <w:p>
+    <w:pPr>
+      <w:pStyle w:val="Header"/>
+      <w:tabs>
+        <w:tab w:val="right" w:pos="9071"/>
+      </w:tabs>
+    </w:pPr>
+  </w:p>
+</w:hdr>
+</file>
+
+<file path=word/header3.xml><?xml version="1.0" encoding="utf-8"?>
+<w:hdr xmlns:wpc="http://schemas.microsoft.com/office/word/2010/wordprocessingCanvas" xmlns:cx="http://schemas.microsoft.com/office/drawing/2014/chartex" xmlns:cx1="http://schemas.microsoft.com/office/drawing/2015/9/8/chartex" xmlns:cx2="http://schemas.microsoft.com/office/drawing/2015/10/21/chartex" xmlns:cx3="http://schemas.microsoft.com/office/drawing/2016/5/9/chartex" xmlns:cx4="http://schemas.microsoft.com/office/drawing/2016/5/10/chartex" xmlns:cx5="http://schemas.microsoft.com/office/drawing/2016/5/11/chartex" xmlns:cx6="http://schemas.microsoft.com/office/drawing/2016/5/12/chartex" xmlns:cx7="http://schemas.microsoft.com/office/drawing/2016/5/13/chartex" xmlns:cx8="http://schemas.microsoft.com/office/drawing/2016/5/14/chartex" xmlns:mc="http://schemas.openxmlformats.org/markup-compatibility/2006" xmlns:m="http://schemas.openxmlformats.org/officeDocument/2006/math" xmlns:aink="http://schemas.microsoft.com/office/drawing/2016/ink" xmlns:am3d="http://schemas.microsoft.com/office/drawing/2017/model3d" xmlns:oel="http://schemas.microsoft.com/office/2019/extlst" xmlns:r="http://schemas.openxmlformats.org/officeDocument/2006/relationships" xmlns:wp14="http://schemas.microsoft.com/office/word/2010/wordprocessingDrawing" xmlns:wp="http://schemas.openxmlformats.org/drawingml/2006/wordprocessingDrawing" xmlns:wpg="http://schemas.microsoft.com/office/word/2010/wordprocessingGroup" xmlns:wpi="http://schemas.microsoft.com/office/word/2010/wordprocessingInk" xmlns:wps="http://schemas.microsoft.com/office/word/2010/wordprocessingShape" xmlns:o="urn:schemas-microsoft-com:office:office" xmlns:v="urn:schemas-microsoft-com:vml" xmlns:w10="urn:schemas-microsoft-com:office:word" xmlns:w="http://schemas.openxmlformats.org/wordprocessingml/2006/main" xmlns:w14="http://schemas.microsoft.com/office/word/2010/wordml" xmlns:w15="http://schemas.microsoft.com/office/word/2012/wordml" xmlns:w16cex="http://schemas.microsoft.com/office/word/2018/wordml/cex" xmlns:w16cid="http://schemas.microsoft.com/office/word/2016/wordml/cid" xmlns:w16="http://schemas.microsoft.com/office/word/2018/wordml" xmlns:w16sdtdh="http://schemas.microsoft.com/office/word/2020/wordml/sdtdatahash" xmlns:w16sdtfl="http://schemas.microsoft.com/office/word/2024/wordml/sdtformatlock" xmlns:w16se="http://schemas.microsoft.com/office/word/2015/wordml/symex" xmlns:w16du="http://schemas.microsoft.com/office/word/2023/wordml/word16du" xmlns:wne="http://schemas.microsoft.com/office/word/2006/wordml" mc:Ignorable="w14 w15 w16se w16cid w16 w16cex w16sdtdh w16sdtfl w16du wp14">
+  <w:p>
+    <w:pPr>
+      <w:pStyle w:val="Header"/>
+      <w:pBdr>
+        <w:bottom w:val="single" w:sz="6" w:space="6" w:color="595959"/>
+      </w:pBdr>
+      <w:tabs>
+        <w:tab w:val="right" w:pos="9071"/>
+      </w:tabs>
+      <w:spacing w:after="120"/>
+      <w:rPr>
         <w:sz w:val="16"/>
       </w:rPr>
-      <w:t>ПРОЈЕКТНА СПЕЦИФИКАЦИЈА</w:t>
+    </w:pPr>
+    <w:r>
+      <w:rPr>
+        <w:color w:val="323232"/>
+        <w:sz w:val="18"/>
+      </w:rPr>
+      <w:t>ОСНОВЕ ИНФОРМАЦИОНЕ БЕЗБЕДНОСТИ</w:t>
     </w:r>
   </w:p>
   <w:p>
@@ -37662,6 +36739,20 @@
       <w:sz w:val="19"/>
     </w:rPr>
   </w:style>
+  <w:style w:type="paragraph" w:customStyle="1" w:styleId="CodeBlock">
+    <w:name w:val="Code Block"/>
+    <w:basedOn w:val="Normal"/>
+    <w:pPr>
+      <w:keepLines/>
+      <w:spacing w:before="120" w:after="140" w:line="252" w:lineRule="auto"/>
+      <w:ind w:left="198" w:right="85"/>
+    </w:pPr>
+    <w:rPr>
+      <w:rFonts w:ascii="Consolas" w:eastAsia="Consolas" w:hAnsi="Consolas" w:cs="Consolas"/>
+      <w:color w:val="1E1E1E"/>
+      <w:sz w:val="18"/>
+    </w:rPr>
+  </w:style>
 </w:styles>
 </file>
 

</xml_diff>